<commit_message>
Update Technical Manual: Section 8.5 site-specific customization
</commit_message>
<xml_diff>
--- a/ACTION_Technical_Manual.docx
+++ b/ACTION_Technical_Manual.docx
@@ -78,7 +78,7 @@
           <w:sz w:val="20"/>
           <w:szCs w:val="20"/>
         </w:rPr>
-        <w:t>Revision date: July 13, 2026</w:t>
+        <w:t>Revision date: July 18, 2026</w:t>
       </w:r>
     </w:p>
     <w:p>
@@ -109,7 +109,7 @@
         </w:pBdr>
         <w:spacing w:before="480" w:after="160"/>
       </w:pPr>
-      <w:bookmarkStart w:id="0" w:name="_Toc234847811"/>
+      <w:bookmarkStart w:id="0" w:name="_Toc235270926"/>
       <w:r>
         <w:rPr>
           <w:rFonts w:ascii="Arial" w:eastAsia="Arial" w:hAnsi="Arial" w:cs="Arial"/>
@@ -127,7 +127,7 @@
     <w:sdt>
       <w:sdtPr>
         <w:alias w:val="Table of Contents"/>
-        <w:id w:val="-1500877572"/>
+        <w:id w:val="615727118"/>
       </w:sdtPr>
       <w:sdtContent>
         <w:p>
@@ -149,7 +149,7 @@
           <w:r>
             <w:fldChar w:fldCharType="separate"/>
           </w:r>
-          <w:hyperlink w:anchor="_Toc234847811" w:history="1">
+          <w:hyperlink w:anchor="_Toc235270926" w:history="1">
             <w:r>
               <w:rPr>
                 <w:rStyle w:val="Hyperlink"/>
@@ -176,7 +176,7 @@
               <w:rPr>
                 <w:noProof/>
               </w:rPr>
-              <w:instrText xml:space="preserve"> PAGEREF _Toc234847811 \h </w:instrText>
+              <w:instrText xml:space="preserve"> PAGEREF _Toc235270926 \h </w:instrText>
             </w:r>
             <w:r>
               <w:rPr>
@@ -213,7 +213,7 @@
               <w:noProof/>
             </w:rPr>
           </w:pPr>
-          <w:hyperlink w:anchor="_Toc234847812" w:history="1">
+          <w:hyperlink w:anchor="_Toc235270927" w:history="1">
             <w:r>
               <w:rPr>
                 <w:rStyle w:val="Hyperlink"/>
@@ -240,7 +240,7 @@
               <w:rPr>
                 <w:noProof/>
               </w:rPr>
-              <w:instrText xml:space="preserve"> PAGEREF _Toc234847812 \h </w:instrText>
+              <w:instrText xml:space="preserve"> PAGEREF _Toc235270927 \h </w:instrText>
             </w:r>
             <w:r>
               <w:rPr>
@@ -277,7 +277,7 @@
               <w:noProof/>
             </w:rPr>
           </w:pPr>
-          <w:hyperlink w:anchor="_Toc234847813" w:history="1">
+          <w:hyperlink w:anchor="_Toc235270928" w:history="1">
             <w:r>
               <w:rPr>
                 <w:rStyle w:val="Hyperlink"/>
@@ -304,7 +304,7 @@
               <w:rPr>
                 <w:noProof/>
               </w:rPr>
-              <w:instrText xml:space="preserve"> PAGEREF _Toc234847813 \h </w:instrText>
+              <w:instrText xml:space="preserve"> PAGEREF _Toc235270928 \h </w:instrText>
             </w:r>
             <w:r>
               <w:rPr>
@@ -341,7 +341,7 @@
               <w:noProof/>
             </w:rPr>
           </w:pPr>
-          <w:hyperlink w:anchor="_Toc234847814" w:history="1">
+          <w:hyperlink w:anchor="_Toc235270929" w:history="1">
             <w:r>
               <w:rPr>
                 <w:rStyle w:val="Hyperlink"/>
@@ -368,7 +368,7 @@
               <w:rPr>
                 <w:noProof/>
               </w:rPr>
-              <w:instrText xml:space="preserve"> PAGEREF _Toc234847814 \h </w:instrText>
+              <w:instrText xml:space="preserve"> PAGEREF _Toc235270929 \h </w:instrText>
             </w:r>
             <w:r>
               <w:rPr>
@@ -405,7 +405,7 @@
               <w:noProof/>
             </w:rPr>
           </w:pPr>
-          <w:hyperlink w:anchor="_Toc234847815" w:history="1">
+          <w:hyperlink w:anchor="_Toc235270930" w:history="1">
             <w:r>
               <w:rPr>
                 <w:rStyle w:val="Hyperlink"/>
@@ -432,7 +432,7 @@
               <w:rPr>
                 <w:noProof/>
               </w:rPr>
-              <w:instrText xml:space="preserve"> PAGEREF _Toc234847815 \h </w:instrText>
+              <w:instrText xml:space="preserve"> PAGEREF _Toc235270930 \h </w:instrText>
             </w:r>
             <w:r>
               <w:rPr>
@@ -469,7 +469,7 @@
               <w:noProof/>
             </w:rPr>
           </w:pPr>
-          <w:hyperlink w:anchor="_Toc234847816" w:history="1">
+          <w:hyperlink w:anchor="_Toc235270931" w:history="1">
             <w:r>
               <w:rPr>
                 <w:rStyle w:val="Hyperlink"/>
@@ -496,7 +496,7 @@
               <w:rPr>
                 <w:noProof/>
               </w:rPr>
-              <w:instrText xml:space="preserve"> PAGEREF _Toc234847816 \h </w:instrText>
+              <w:instrText xml:space="preserve"> PAGEREF _Toc235270931 \h </w:instrText>
             </w:r>
             <w:r>
               <w:rPr>
@@ -533,7 +533,7 @@
               <w:noProof/>
             </w:rPr>
           </w:pPr>
-          <w:hyperlink w:anchor="_Toc234847817" w:history="1">
+          <w:hyperlink w:anchor="_Toc235270932" w:history="1">
             <w:r>
               <w:rPr>
                 <w:rStyle w:val="Hyperlink"/>
@@ -560,7 +560,7 @@
               <w:rPr>
                 <w:noProof/>
               </w:rPr>
-              <w:instrText xml:space="preserve"> PAGEREF _Toc234847817 \h </w:instrText>
+              <w:instrText xml:space="preserve"> PAGEREF _Toc235270932 \h </w:instrText>
             </w:r>
             <w:r>
               <w:rPr>
@@ -597,7 +597,7 @@
               <w:noProof/>
             </w:rPr>
           </w:pPr>
-          <w:hyperlink w:anchor="_Toc234847818" w:history="1">
+          <w:hyperlink w:anchor="_Toc235270933" w:history="1">
             <w:r>
               <w:rPr>
                 <w:rStyle w:val="Hyperlink"/>
@@ -624,7 +624,7 @@
               <w:rPr>
                 <w:noProof/>
               </w:rPr>
-              <w:instrText xml:space="preserve"> PAGEREF _Toc234847818 \h </w:instrText>
+              <w:instrText xml:space="preserve"> PAGEREF _Toc235270933 \h </w:instrText>
             </w:r>
             <w:r>
               <w:rPr>
@@ -661,7 +661,7 @@
               <w:noProof/>
             </w:rPr>
           </w:pPr>
-          <w:hyperlink w:anchor="_Toc234847819" w:history="1">
+          <w:hyperlink w:anchor="_Toc235270934" w:history="1">
             <w:r>
               <w:rPr>
                 <w:rStyle w:val="Hyperlink"/>
@@ -688,7 +688,7 @@
               <w:rPr>
                 <w:noProof/>
               </w:rPr>
-              <w:instrText xml:space="preserve"> PAGEREF _Toc234847819 \h </w:instrText>
+              <w:instrText xml:space="preserve"> PAGEREF _Toc235270934 \h </w:instrText>
             </w:r>
             <w:r>
               <w:rPr>
@@ -725,7 +725,7 @@
               <w:noProof/>
             </w:rPr>
           </w:pPr>
-          <w:hyperlink w:anchor="_Toc234847820" w:history="1">
+          <w:hyperlink w:anchor="_Toc235270935" w:history="1">
             <w:r>
               <w:rPr>
                 <w:rStyle w:val="Hyperlink"/>
@@ -752,7 +752,7 @@
               <w:rPr>
                 <w:noProof/>
               </w:rPr>
-              <w:instrText xml:space="preserve"> PAGEREF _Toc234847820 \h </w:instrText>
+              <w:instrText xml:space="preserve"> PAGEREF _Toc235270935 \h </w:instrText>
             </w:r>
             <w:r>
               <w:rPr>
@@ -789,7 +789,7 @@
               <w:noProof/>
             </w:rPr>
           </w:pPr>
-          <w:hyperlink w:anchor="_Toc234847821" w:history="1">
+          <w:hyperlink w:anchor="_Toc235270936" w:history="1">
             <w:r>
               <w:rPr>
                 <w:rStyle w:val="Hyperlink"/>
@@ -816,7 +816,7 @@
               <w:rPr>
                 <w:noProof/>
               </w:rPr>
-              <w:instrText xml:space="preserve"> PAGEREF _Toc234847821 \h </w:instrText>
+              <w:instrText xml:space="preserve"> PAGEREF _Toc235270936 \h </w:instrText>
             </w:r>
             <w:r>
               <w:rPr>
@@ -853,7 +853,7 @@
               <w:noProof/>
             </w:rPr>
           </w:pPr>
-          <w:hyperlink w:anchor="_Toc234847822" w:history="1">
+          <w:hyperlink w:anchor="_Toc235270937" w:history="1">
             <w:r>
               <w:rPr>
                 <w:rStyle w:val="Hyperlink"/>
@@ -880,7 +880,7 @@
               <w:rPr>
                 <w:noProof/>
               </w:rPr>
-              <w:instrText xml:space="preserve"> PAGEREF _Toc234847822 \h </w:instrText>
+              <w:instrText xml:space="preserve"> PAGEREF _Toc235270937 \h </w:instrText>
             </w:r>
             <w:r>
               <w:rPr>
@@ -917,7 +917,7 @@
               <w:noProof/>
             </w:rPr>
           </w:pPr>
-          <w:hyperlink w:anchor="_Toc234847823" w:history="1">
+          <w:hyperlink w:anchor="_Toc235270938" w:history="1">
             <w:r>
               <w:rPr>
                 <w:rStyle w:val="Hyperlink"/>
@@ -944,7 +944,7 @@
               <w:rPr>
                 <w:noProof/>
               </w:rPr>
-              <w:instrText xml:space="preserve"> PAGEREF _Toc234847823 \h </w:instrText>
+              <w:instrText xml:space="preserve"> PAGEREF _Toc235270938 \h </w:instrText>
             </w:r>
             <w:r>
               <w:rPr>
@@ -981,7 +981,7 @@
               <w:noProof/>
             </w:rPr>
           </w:pPr>
-          <w:hyperlink w:anchor="_Toc234847824" w:history="1">
+          <w:hyperlink w:anchor="_Toc235270939" w:history="1">
             <w:r>
               <w:rPr>
                 <w:rStyle w:val="Hyperlink"/>
@@ -1008,7 +1008,7 @@
               <w:rPr>
                 <w:noProof/>
               </w:rPr>
-              <w:instrText xml:space="preserve"> PAGEREF _Toc234847824 \h </w:instrText>
+              <w:instrText xml:space="preserve"> PAGEREF _Toc235270939 \h </w:instrText>
             </w:r>
             <w:r>
               <w:rPr>
@@ -1045,7 +1045,7 @@
               <w:noProof/>
             </w:rPr>
           </w:pPr>
-          <w:hyperlink w:anchor="_Toc234847825" w:history="1">
+          <w:hyperlink w:anchor="_Toc235270940" w:history="1">
             <w:r>
               <w:rPr>
                 <w:rStyle w:val="Hyperlink"/>
@@ -1072,7 +1072,7 @@
               <w:rPr>
                 <w:noProof/>
               </w:rPr>
-              <w:instrText xml:space="preserve"> PAGEREF _Toc234847825 \h </w:instrText>
+              <w:instrText xml:space="preserve"> PAGEREF _Toc235270940 \h </w:instrText>
             </w:r>
             <w:r>
               <w:rPr>
@@ -1109,7 +1109,7 @@
               <w:noProof/>
             </w:rPr>
           </w:pPr>
-          <w:hyperlink w:anchor="_Toc234847826" w:history="1">
+          <w:hyperlink w:anchor="_Toc235270941" w:history="1">
             <w:r>
               <w:rPr>
                 <w:rStyle w:val="Hyperlink"/>
@@ -1136,7 +1136,7 @@
               <w:rPr>
                 <w:noProof/>
               </w:rPr>
-              <w:instrText xml:space="preserve"> PAGEREF _Toc234847826 \h </w:instrText>
+              <w:instrText xml:space="preserve"> PAGEREF _Toc235270941 \h </w:instrText>
             </w:r>
             <w:r>
               <w:rPr>
@@ -1173,7 +1173,7 @@
               <w:noProof/>
             </w:rPr>
           </w:pPr>
-          <w:hyperlink w:anchor="_Toc234847827" w:history="1">
+          <w:hyperlink w:anchor="_Toc235270942" w:history="1">
             <w:r>
               <w:rPr>
                 <w:rStyle w:val="Hyperlink"/>
@@ -1200,7 +1200,7 @@
               <w:rPr>
                 <w:noProof/>
               </w:rPr>
-              <w:instrText xml:space="preserve"> PAGEREF _Toc234847827 \h </w:instrText>
+              <w:instrText xml:space="preserve"> PAGEREF _Toc235270942 \h </w:instrText>
             </w:r>
             <w:r>
               <w:rPr>
@@ -1237,7 +1237,7 @@
               <w:noProof/>
             </w:rPr>
           </w:pPr>
-          <w:hyperlink w:anchor="_Toc234847828" w:history="1">
+          <w:hyperlink w:anchor="_Toc235270943" w:history="1">
             <w:r>
               <w:rPr>
                 <w:rStyle w:val="Hyperlink"/>
@@ -1264,7 +1264,7 @@
               <w:rPr>
                 <w:noProof/>
               </w:rPr>
-              <w:instrText xml:space="preserve"> PAGEREF _Toc234847828 \h </w:instrText>
+              <w:instrText xml:space="preserve"> PAGEREF _Toc235270943 \h </w:instrText>
             </w:r>
             <w:r>
               <w:rPr>
@@ -1301,7 +1301,7 @@
               <w:noProof/>
             </w:rPr>
           </w:pPr>
-          <w:hyperlink w:anchor="_Toc234847829" w:history="1">
+          <w:hyperlink w:anchor="_Toc235270944" w:history="1">
             <w:r>
               <w:rPr>
                 <w:rStyle w:val="Hyperlink"/>
@@ -1328,7 +1328,7 @@
               <w:rPr>
                 <w:noProof/>
               </w:rPr>
-              <w:instrText xml:space="preserve"> PAGEREF _Toc234847829 \h </w:instrText>
+              <w:instrText xml:space="preserve"> PAGEREF _Toc235270944 \h </w:instrText>
             </w:r>
             <w:r>
               <w:rPr>
@@ -1365,7 +1365,7 @@
               <w:noProof/>
             </w:rPr>
           </w:pPr>
-          <w:hyperlink w:anchor="_Toc234847830" w:history="1">
+          <w:hyperlink w:anchor="_Toc235270945" w:history="1">
             <w:r>
               <w:rPr>
                 <w:rStyle w:val="Hyperlink"/>
@@ -1392,7 +1392,7 @@
               <w:rPr>
                 <w:noProof/>
               </w:rPr>
-              <w:instrText xml:space="preserve"> PAGEREF _Toc234847830 \h </w:instrText>
+              <w:instrText xml:space="preserve"> PAGEREF _Toc235270945 \h </w:instrText>
             </w:r>
             <w:r>
               <w:rPr>
@@ -1429,7 +1429,7 @@
               <w:noProof/>
             </w:rPr>
           </w:pPr>
-          <w:hyperlink w:anchor="_Toc234847831" w:history="1">
+          <w:hyperlink w:anchor="_Toc235270946" w:history="1">
             <w:r>
               <w:rPr>
                 <w:rStyle w:val="Hyperlink"/>
@@ -1456,7 +1456,7 @@
               <w:rPr>
                 <w:noProof/>
               </w:rPr>
-              <w:instrText xml:space="preserve"> PAGEREF _Toc234847831 \h </w:instrText>
+              <w:instrText xml:space="preserve"> PAGEREF _Toc235270946 \h </w:instrText>
             </w:r>
             <w:r>
               <w:rPr>
@@ -1493,7 +1493,7 @@
               <w:noProof/>
             </w:rPr>
           </w:pPr>
-          <w:hyperlink w:anchor="_Toc234847832" w:history="1">
+          <w:hyperlink w:anchor="_Toc235270947" w:history="1">
             <w:r>
               <w:rPr>
                 <w:rStyle w:val="Hyperlink"/>
@@ -1520,7 +1520,7 @@
               <w:rPr>
                 <w:noProof/>
               </w:rPr>
-              <w:instrText xml:space="preserve"> PAGEREF _Toc234847832 \h </w:instrText>
+              <w:instrText xml:space="preserve"> PAGEREF _Toc235270947 \h </w:instrText>
             </w:r>
             <w:r>
               <w:rPr>
@@ -1557,7 +1557,7 @@
               <w:noProof/>
             </w:rPr>
           </w:pPr>
-          <w:hyperlink w:anchor="_Toc234847833" w:history="1">
+          <w:hyperlink w:anchor="_Toc235270948" w:history="1">
             <w:r>
               <w:rPr>
                 <w:rStyle w:val="Hyperlink"/>
@@ -1584,7 +1584,7 @@
               <w:rPr>
                 <w:noProof/>
               </w:rPr>
-              <w:instrText xml:space="preserve"> PAGEREF _Toc234847833 \h </w:instrText>
+              <w:instrText xml:space="preserve"> PAGEREF _Toc235270948 \h </w:instrText>
             </w:r>
             <w:r>
               <w:rPr>
@@ -1621,7 +1621,7 @@
               <w:noProof/>
             </w:rPr>
           </w:pPr>
-          <w:hyperlink w:anchor="_Toc234847834" w:history="1">
+          <w:hyperlink w:anchor="_Toc235270949" w:history="1">
             <w:r>
               <w:rPr>
                 <w:rStyle w:val="Hyperlink"/>
@@ -1648,7 +1648,7 @@
               <w:rPr>
                 <w:noProof/>
               </w:rPr>
-              <w:instrText xml:space="preserve"> PAGEREF _Toc234847834 \h </w:instrText>
+              <w:instrText xml:space="preserve"> PAGEREF _Toc235270949 \h </w:instrText>
             </w:r>
             <w:r>
               <w:rPr>
@@ -1685,7 +1685,7 @@
               <w:noProof/>
             </w:rPr>
           </w:pPr>
-          <w:hyperlink w:anchor="_Toc234847835" w:history="1">
+          <w:hyperlink w:anchor="_Toc235270950" w:history="1">
             <w:r>
               <w:rPr>
                 <w:rStyle w:val="Hyperlink"/>
@@ -1712,7 +1712,7 @@
               <w:rPr>
                 <w:noProof/>
               </w:rPr>
-              <w:instrText xml:space="preserve"> PAGEREF _Toc234847835 \h </w:instrText>
+              <w:instrText xml:space="preserve"> PAGEREF _Toc235270950 \h </w:instrText>
             </w:r>
             <w:r>
               <w:rPr>
@@ -1749,7 +1749,7 @@
               <w:noProof/>
             </w:rPr>
           </w:pPr>
-          <w:hyperlink w:anchor="_Toc234847836" w:history="1">
+          <w:hyperlink w:anchor="_Toc235270951" w:history="1">
             <w:r>
               <w:rPr>
                 <w:rStyle w:val="Hyperlink"/>
@@ -1776,7 +1776,7 @@
               <w:rPr>
                 <w:noProof/>
               </w:rPr>
-              <w:instrText xml:space="preserve"> PAGEREF _Toc234847836 \h </w:instrText>
+              <w:instrText xml:space="preserve"> PAGEREF _Toc235270951 \h </w:instrText>
             </w:r>
             <w:r>
               <w:rPr>
@@ -1813,7 +1813,7 @@
               <w:noProof/>
             </w:rPr>
           </w:pPr>
-          <w:hyperlink w:anchor="_Toc234847837" w:history="1">
+          <w:hyperlink w:anchor="_Toc235270952" w:history="1">
             <w:r>
               <w:rPr>
                 <w:rStyle w:val="Hyperlink"/>
@@ -1840,7 +1840,7 @@
               <w:rPr>
                 <w:noProof/>
               </w:rPr>
-              <w:instrText xml:space="preserve"> PAGEREF _Toc234847837 \h </w:instrText>
+              <w:instrText xml:space="preserve"> PAGEREF _Toc235270952 \h </w:instrText>
             </w:r>
             <w:r>
               <w:rPr>
@@ -1877,7 +1877,7 @@
               <w:noProof/>
             </w:rPr>
           </w:pPr>
-          <w:hyperlink w:anchor="_Toc234847838" w:history="1">
+          <w:hyperlink w:anchor="_Toc235270953" w:history="1">
             <w:r>
               <w:rPr>
                 <w:rStyle w:val="Hyperlink"/>
@@ -1904,7 +1904,7 @@
               <w:rPr>
                 <w:noProof/>
               </w:rPr>
-              <w:instrText xml:space="preserve"> PAGEREF _Toc234847838 \h </w:instrText>
+              <w:instrText xml:space="preserve"> PAGEREF _Toc235270953 \h </w:instrText>
             </w:r>
             <w:r>
               <w:rPr>
@@ -1941,7 +1941,7 @@
               <w:noProof/>
             </w:rPr>
           </w:pPr>
-          <w:hyperlink w:anchor="_Toc234847839" w:history="1">
+          <w:hyperlink w:anchor="_Toc235270954" w:history="1">
             <w:r>
               <w:rPr>
                 <w:rStyle w:val="Hyperlink"/>
@@ -1968,7 +1968,7 @@
               <w:rPr>
                 <w:noProof/>
               </w:rPr>
-              <w:instrText xml:space="preserve"> PAGEREF _Toc234847839 \h </w:instrText>
+              <w:instrText xml:space="preserve"> PAGEREF _Toc235270954 \h </w:instrText>
             </w:r>
             <w:r>
               <w:rPr>
@@ -2005,7 +2005,7 @@
               <w:noProof/>
             </w:rPr>
           </w:pPr>
-          <w:hyperlink w:anchor="_Toc234847840" w:history="1">
+          <w:hyperlink w:anchor="_Toc235270955" w:history="1">
             <w:r>
               <w:rPr>
                 <w:rStyle w:val="Hyperlink"/>
@@ -2032,7 +2032,7 @@
               <w:rPr>
                 <w:noProof/>
               </w:rPr>
-              <w:instrText xml:space="preserve"> PAGEREF _Toc234847840 \h </w:instrText>
+              <w:instrText xml:space="preserve"> PAGEREF _Toc235270955 \h </w:instrText>
             </w:r>
             <w:r>
               <w:rPr>
@@ -2069,7 +2069,7 @@
               <w:noProof/>
             </w:rPr>
           </w:pPr>
-          <w:hyperlink w:anchor="_Toc234847841" w:history="1">
+          <w:hyperlink w:anchor="_Toc235270956" w:history="1">
             <w:r>
               <w:rPr>
                 <w:rStyle w:val="Hyperlink"/>
@@ -2096,7 +2096,7 @@
               <w:rPr>
                 <w:noProof/>
               </w:rPr>
-              <w:instrText xml:space="preserve"> PAGEREF _Toc234847841 \h </w:instrText>
+              <w:instrText xml:space="preserve"> PAGEREF _Toc235270956 \h </w:instrText>
             </w:r>
             <w:r>
               <w:rPr>
@@ -2133,7 +2133,7 @@
               <w:noProof/>
             </w:rPr>
           </w:pPr>
-          <w:hyperlink w:anchor="_Toc234847842" w:history="1">
+          <w:hyperlink w:anchor="_Toc235270957" w:history="1">
             <w:r>
               <w:rPr>
                 <w:rStyle w:val="Hyperlink"/>
@@ -2160,7 +2160,7 @@
               <w:rPr>
                 <w:noProof/>
               </w:rPr>
-              <w:instrText xml:space="preserve"> PAGEREF _Toc234847842 \h </w:instrText>
+              <w:instrText xml:space="preserve"> PAGEREF _Toc235270957 \h </w:instrText>
             </w:r>
             <w:r>
               <w:rPr>
@@ -2197,7 +2197,7 @@
               <w:noProof/>
             </w:rPr>
           </w:pPr>
-          <w:hyperlink w:anchor="_Toc234847843" w:history="1">
+          <w:hyperlink w:anchor="_Toc235270958" w:history="1">
             <w:r>
               <w:rPr>
                 <w:rStyle w:val="Hyperlink"/>
@@ -2224,7 +2224,7 @@
               <w:rPr>
                 <w:noProof/>
               </w:rPr>
-              <w:instrText xml:space="preserve"> PAGEREF _Toc234847843 \h </w:instrText>
+              <w:instrText xml:space="preserve"> PAGEREF _Toc235270958 \h </w:instrText>
             </w:r>
             <w:r>
               <w:rPr>
@@ -2261,7 +2261,7 @@
               <w:noProof/>
             </w:rPr>
           </w:pPr>
-          <w:hyperlink w:anchor="_Toc234847844" w:history="1">
+          <w:hyperlink w:anchor="_Toc235270959" w:history="1">
             <w:r>
               <w:rPr>
                 <w:rStyle w:val="Hyperlink"/>
@@ -2288,7 +2288,7 @@
               <w:rPr>
                 <w:noProof/>
               </w:rPr>
-              <w:instrText xml:space="preserve"> PAGEREF _Toc234847844 \h </w:instrText>
+              <w:instrText xml:space="preserve"> PAGEREF _Toc235270959 \h </w:instrText>
             </w:r>
             <w:r>
               <w:rPr>
@@ -2325,7 +2325,7 @@
               <w:noProof/>
             </w:rPr>
           </w:pPr>
-          <w:hyperlink w:anchor="_Toc234847845" w:history="1">
+          <w:hyperlink w:anchor="_Toc235270960" w:history="1">
             <w:r>
               <w:rPr>
                 <w:rStyle w:val="Hyperlink"/>
@@ -2352,7 +2352,7 @@
               <w:rPr>
                 <w:noProof/>
               </w:rPr>
-              <w:instrText xml:space="preserve"> PAGEREF _Toc234847845 \h </w:instrText>
+              <w:instrText xml:space="preserve"> PAGEREF _Toc235270960 \h </w:instrText>
             </w:r>
             <w:r>
               <w:rPr>
@@ -2389,7 +2389,7 @@
               <w:noProof/>
             </w:rPr>
           </w:pPr>
-          <w:hyperlink w:anchor="_Toc234847846" w:history="1">
+          <w:hyperlink w:anchor="_Toc235270961" w:history="1">
             <w:r>
               <w:rPr>
                 <w:rStyle w:val="Hyperlink"/>
@@ -2416,7 +2416,7 @@
               <w:rPr>
                 <w:noProof/>
               </w:rPr>
-              <w:instrText xml:space="preserve"> PAGEREF _Toc234847846 \h </w:instrText>
+              <w:instrText xml:space="preserve"> PAGEREF _Toc235270961 \h </w:instrText>
             </w:r>
             <w:r>
               <w:rPr>
@@ -2453,7 +2453,7 @@
               <w:noProof/>
             </w:rPr>
           </w:pPr>
-          <w:hyperlink w:anchor="_Toc234847847" w:history="1">
+          <w:hyperlink w:anchor="_Toc235270962" w:history="1">
             <w:r>
               <w:rPr>
                 <w:rStyle w:val="Hyperlink"/>
@@ -2480,7 +2480,7 @@
               <w:rPr>
                 <w:noProof/>
               </w:rPr>
-              <w:instrText xml:space="preserve"> PAGEREF _Toc234847847 \h </w:instrText>
+              <w:instrText xml:space="preserve"> PAGEREF _Toc235270962 \h </w:instrText>
             </w:r>
             <w:r>
               <w:rPr>
@@ -2517,7 +2517,7 @@
               <w:noProof/>
             </w:rPr>
           </w:pPr>
-          <w:hyperlink w:anchor="_Toc234847848" w:history="1">
+          <w:hyperlink w:anchor="_Toc235270963" w:history="1">
             <w:r>
               <w:rPr>
                 <w:rStyle w:val="Hyperlink"/>
@@ -2544,7 +2544,7 @@
               <w:rPr>
                 <w:noProof/>
               </w:rPr>
-              <w:instrText xml:space="preserve"> PAGEREF _Toc234847848 \h </w:instrText>
+              <w:instrText xml:space="preserve"> PAGEREF _Toc235270963 \h </w:instrText>
             </w:r>
             <w:r>
               <w:rPr>
@@ -2581,7 +2581,7 @@
               <w:noProof/>
             </w:rPr>
           </w:pPr>
-          <w:hyperlink w:anchor="_Toc234847849" w:history="1">
+          <w:hyperlink w:anchor="_Toc235270964" w:history="1">
             <w:r>
               <w:rPr>
                 <w:rStyle w:val="Hyperlink"/>
@@ -2608,7 +2608,7 @@
               <w:rPr>
                 <w:noProof/>
               </w:rPr>
-              <w:instrText xml:space="preserve"> PAGEREF _Toc234847849 \h </w:instrText>
+              <w:instrText xml:space="preserve"> PAGEREF _Toc235270964 \h </w:instrText>
             </w:r>
             <w:r>
               <w:rPr>
@@ -2645,7 +2645,7 @@
               <w:noProof/>
             </w:rPr>
           </w:pPr>
-          <w:hyperlink w:anchor="_Toc234847850" w:history="1">
+          <w:hyperlink w:anchor="_Toc235270965" w:history="1">
             <w:r>
               <w:rPr>
                 <w:rStyle w:val="Hyperlink"/>
@@ -2672,7 +2672,7 @@
               <w:rPr>
                 <w:noProof/>
               </w:rPr>
-              <w:instrText xml:space="preserve"> PAGEREF _Toc234847850 \h </w:instrText>
+              <w:instrText xml:space="preserve"> PAGEREF _Toc235270965 \h </w:instrText>
             </w:r>
             <w:r>
               <w:rPr>
@@ -2690,6 +2690,262 @@
                 <w:noProof/>
               </w:rPr>
               <w:t>12</w:t>
+            </w:r>
+            <w:r>
+              <w:rPr>
+                <w:noProof/>
+              </w:rPr>
+              <w:fldChar w:fldCharType="end"/>
+            </w:r>
+          </w:hyperlink>
+        </w:p>
+        <w:p>
+          <w:pPr>
+            <w:pStyle w:val="TOC2"/>
+            <w:tabs>
+              <w:tab w:val="right" w:leader="dot" w:pos="10070"/>
+            </w:tabs>
+            <w:rPr>
+              <w:noProof/>
+            </w:rPr>
+          </w:pPr>
+          <w:hyperlink w:anchor="_Toc235270966" w:history="1">
+            <w:r>
+              <w:rPr>
+                <w:rStyle w:val="Hyperlink"/>
+                <w:rFonts w:ascii="Arial" w:eastAsia="Arial" w:hAnsi="Arial" w:cs="Arial"/>
+                <w:b/>
+                <w:bCs/>
+                <w:noProof/>
+              </w:rPr>
+              <w:t>8.5 Site-Specific Customization</w:t>
+            </w:r>
+            <w:r>
+              <w:rPr>
+                <w:noProof/>
+              </w:rPr>
+              <w:tab/>
+            </w:r>
+            <w:r>
+              <w:rPr>
+                <w:noProof/>
+              </w:rPr>
+              <w:fldChar w:fldCharType="begin"/>
+            </w:r>
+            <w:r>
+              <w:rPr>
+                <w:noProof/>
+              </w:rPr>
+              <w:instrText xml:space="preserve"> PAGEREF _Toc235270966 \h </w:instrText>
+            </w:r>
+            <w:r>
+              <w:rPr>
+                <w:noProof/>
+              </w:rPr>
+            </w:r>
+            <w:r>
+              <w:rPr>
+                <w:noProof/>
+              </w:rPr>
+              <w:fldChar w:fldCharType="separate"/>
+            </w:r>
+            <w:r>
+              <w:rPr>
+                <w:noProof/>
+              </w:rPr>
+              <w:t>12</w:t>
+            </w:r>
+            <w:r>
+              <w:rPr>
+                <w:noProof/>
+              </w:rPr>
+              <w:fldChar w:fldCharType="end"/>
+            </w:r>
+          </w:hyperlink>
+        </w:p>
+        <w:p>
+          <w:pPr>
+            <w:pStyle w:val="TOC3"/>
+            <w:tabs>
+              <w:tab w:val="right" w:leader="dot" w:pos="10070"/>
+            </w:tabs>
+            <w:rPr>
+              <w:noProof/>
+            </w:rPr>
+          </w:pPr>
+          <w:hyperlink w:anchor="_Toc235270967" w:history="1">
+            <w:r>
+              <w:rPr>
+                <w:rStyle w:val="Hyperlink"/>
+                <w:rFonts w:ascii="Arial" w:eastAsia="Arial" w:hAnsi="Arial" w:cs="Arial"/>
+                <w:b/>
+                <w:bCs/>
+                <w:noProof/>
+              </w:rPr>
+              <w:t>webimage.png</w:t>
+            </w:r>
+            <w:r>
+              <w:rPr>
+                <w:noProof/>
+              </w:rPr>
+              <w:tab/>
+            </w:r>
+            <w:r>
+              <w:rPr>
+                <w:noProof/>
+              </w:rPr>
+              <w:fldChar w:fldCharType="begin"/>
+            </w:r>
+            <w:r>
+              <w:rPr>
+                <w:noProof/>
+              </w:rPr>
+              <w:instrText xml:space="preserve"> PAGEREF _Toc235270967 \h </w:instrText>
+            </w:r>
+            <w:r>
+              <w:rPr>
+                <w:noProof/>
+              </w:rPr>
+            </w:r>
+            <w:r>
+              <w:rPr>
+                <w:noProof/>
+              </w:rPr>
+              <w:fldChar w:fldCharType="separate"/>
+            </w:r>
+            <w:r>
+              <w:rPr>
+                <w:noProof/>
+              </w:rPr>
+              <w:t>12</w:t>
+            </w:r>
+            <w:r>
+              <w:rPr>
+                <w:noProof/>
+              </w:rPr>
+              <w:fldChar w:fldCharType="end"/>
+            </w:r>
+          </w:hyperlink>
+        </w:p>
+        <w:p>
+          <w:pPr>
+            <w:pStyle w:val="TOC3"/>
+            <w:tabs>
+              <w:tab w:val="right" w:leader="dot" w:pos="10070"/>
+            </w:tabs>
+            <w:rPr>
+              <w:noProof/>
+            </w:rPr>
+          </w:pPr>
+          <w:hyperlink w:anchor="_Toc235270968" w:history="1">
+            <w:r>
+              <w:rPr>
+                <w:rStyle w:val="Hyperlink"/>
+                <w:rFonts w:ascii="Arial" w:eastAsia="Arial" w:hAnsi="Arial" w:cs="Arial"/>
+                <w:b/>
+                <w:bCs/>
+                <w:noProof/>
+              </w:rPr>
+              <w:t>webinfo.txt (optional)</w:t>
+            </w:r>
+            <w:r>
+              <w:rPr>
+                <w:noProof/>
+              </w:rPr>
+              <w:tab/>
+            </w:r>
+            <w:r>
+              <w:rPr>
+                <w:noProof/>
+              </w:rPr>
+              <w:fldChar w:fldCharType="begin"/>
+            </w:r>
+            <w:r>
+              <w:rPr>
+                <w:noProof/>
+              </w:rPr>
+              <w:instrText xml:space="preserve"> PAGEREF _Toc235270968 \h </w:instrText>
+            </w:r>
+            <w:r>
+              <w:rPr>
+                <w:noProof/>
+              </w:rPr>
+            </w:r>
+            <w:r>
+              <w:rPr>
+                <w:noProof/>
+              </w:rPr>
+              <w:fldChar w:fldCharType="separate"/>
+            </w:r>
+            <w:r>
+              <w:rPr>
+                <w:noProof/>
+              </w:rPr>
+              <w:t>12</w:t>
+            </w:r>
+            <w:r>
+              <w:rPr>
+                <w:noProof/>
+              </w:rPr>
+              <w:fldChar w:fldCharType="end"/>
+            </w:r>
+          </w:hyperlink>
+        </w:p>
+        <w:p>
+          <w:pPr>
+            <w:pStyle w:val="TOC3"/>
+            <w:tabs>
+              <w:tab w:val="right" w:leader="dot" w:pos="10070"/>
+            </w:tabs>
+            <w:rPr>
+              <w:noProof/>
+            </w:rPr>
+          </w:pPr>
+          <w:hyperlink w:anchor="_Toc235270969" w:history="1">
+            <w:r>
+              <w:rPr>
+                <w:rStyle w:val="Hyperlink"/>
+                <w:rFonts w:ascii="Arial" w:eastAsia="Arial" w:hAnsi="Arial" w:cs="Arial"/>
+                <w:b/>
+                <w:bCs/>
+                <w:noProof/>
+              </w:rPr>
+              <w:t>STATION_LOCATION (tide.env)</w:t>
+            </w:r>
+            <w:r>
+              <w:rPr>
+                <w:noProof/>
+              </w:rPr>
+              <w:tab/>
+            </w:r>
+            <w:r>
+              <w:rPr>
+                <w:noProof/>
+              </w:rPr>
+              <w:fldChar w:fldCharType="begin"/>
+            </w:r>
+            <w:r>
+              <w:rPr>
+                <w:noProof/>
+              </w:rPr>
+              <w:instrText xml:space="preserve"> PAGEREF _Toc235270969 \h </w:instrText>
+            </w:r>
+            <w:r>
+              <w:rPr>
+                <w:noProof/>
+              </w:rPr>
+            </w:r>
+            <w:r>
+              <w:rPr>
+                <w:noProof/>
+              </w:rPr>
+              <w:fldChar w:fldCharType="separate"/>
+            </w:r>
+            <w:r>
+              <w:rPr>
+                <w:noProof/>
+              </w:rPr>
+              <w:t>13</w:t>
             </w:r>
             <w:r>
               <w:rPr>
@@ -2709,7 +2965,7 @@
               <w:noProof/>
             </w:rPr>
           </w:pPr>
-          <w:hyperlink w:anchor="_Toc234847851" w:history="1">
+          <w:hyperlink w:anchor="_Toc235270970" w:history="1">
             <w:r>
               <w:rPr>
                 <w:rStyle w:val="Hyperlink"/>
@@ -2736,7 +2992,7 @@
               <w:rPr>
                 <w:noProof/>
               </w:rPr>
-              <w:instrText xml:space="preserve"> PAGEREF _Toc234847851 \h </w:instrText>
+              <w:instrText xml:space="preserve"> PAGEREF _Toc235270970 \h </w:instrText>
             </w:r>
             <w:r>
               <w:rPr>
@@ -2753,7 +3009,7 @@
               <w:rPr>
                 <w:noProof/>
               </w:rPr>
-              <w:t>13</w:t>
+              <w:t>14</w:t>
             </w:r>
             <w:r>
               <w:rPr>
@@ -2773,7 +3029,7 @@
               <w:noProof/>
             </w:rPr>
           </w:pPr>
-          <w:hyperlink w:anchor="_Toc234847852" w:history="1">
+          <w:hyperlink w:anchor="_Toc235270971" w:history="1">
             <w:r>
               <w:rPr>
                 <w:rStyle w:val="Hyperlink"/>
@@ -2800,7 +3056,7 @@
               <w:rPr>
                 <w:noProof/>
               </w:rPr>
-              <w:instrText xml:space="preserve"> PAGEREF _Toc234847852 \h </w:instrText>
+              <w:instrText xml:space="preserve"> PAGEREF _Toc235270971 \h </w:instrText>
             </w:r>
             <w:r>
               <w:rPr>
@@ -2817,7 +3073,7 @@
               <w:rPr>
                 <w:noProof/>
               </w:rPr>
-              <w:t>13</w:t>
+              <w:t>14</w:t>
             </w:r>
             <w:r>
               <w:rPr>
@@ -2837,7 +3093,7 @@
               <w:noProof/>
             </w:rPr>
           </w:pPr>
-          <w:hyperlink w:anchor="_Toc234847853" w:history="1">
+          <w:hyperlink w:anchor="_Toc235270972" w:history="1">
             <w:r>
               <w:rPr>
                 <w:rStyle w:val="Hyperlink"/>
@@ -2864,7 +3120,7 @@
               <w:rPr>
                 <w:noProof/>
               </w:rPr>
-              <w:instrText xml:space="preserve"> PAGEREF _Toc234847853 \h </w:instrText>
+              <w:instrText xml:space="preserve"> PAGEREF _Toc235270972 \h </w:instrText>
             </w:r>
             <w:r>
               <w:rPr>
@@ -2881,7 +3137,7 @@
               <w:rPr>
                 <w:noProof/>
               </w:rPr>
-              <w:t>13</w:t>
+              <w:t>14</w:t>
             </w:r>
             <w:r>
               <w:rPr>
@@ -2901,7 +3157,7 @@
               <w:noProof/>
             </w:rPr>
           </w:pPr>
-          <w:hyperlink w:anchor="_Toc234847854" w:history="1">
+          <w:hyperlink w:anchor="_Toc235270973" w:history="1">
             <w:r>
               <w:rPr>
                 <w:rStyle w:val="Hyperlink"/>
@@ -2928,7 +3184,7 @@
               <w:rPr>
                 <w:noProof/>
               </w:rPr>
-              <w:instrText xml:space="preserve"> PAGEREF _Toc234847854 \h </w:instrText>
+              <w:instrText xml:space="preserve"> PAGEREF _Toc235270973 \h </w:instrText>
             </w:r>
             <w:r>
               <w:rPr>
@@ -2945,7 +3201,7 @@
               <w:rPr>
                 <w:noProof/>
               </w:rPr>
-              <w:t>13</w:t>
+              <w:t>14</w:t>
             </w:r>
             <w:r>
               <w:rPr>
@@ -2965,7 +3221,7 @@
               <w:noProof/>
             </w:rPr>
           </w:pPr>
-          <w:hyperlink w:anchor="_Toc234847855" w:history="1">
+          <w:hyperlink w:anchor="_Toc235270974" w:history="1">
             <w:r>
               <w:rPr>
                 <w:rStyle w:val="Hyperlink"/>
@@ -2992,7 +3248,7 @@
               <w:rPr>
                 <w:noProof/>
               </w:rPr>
-              <w:instrText xml:space="preserve"> PAGEREF _Toc234847855 \h </w:instrText>
+              <w:instrText xml:space="preserve"> PAGEREF _Toc235270974 \h </w:instrText>
             </w:r>
             <w:r>
               <w:rPr>
@@ -3009,7 +3265,7 @@
               <w:rPr>
                 <w:noProof/>
               </w:rPr>
-              <w:t>14</w:t>
+              <w:t>15</w:t>
             </w:r>
             <w:r>
               <w:rPr>
@@ -3029,7 +3285,7 @@
               <w:noProof/>
             </w:rPr>
           </w:pPr>
-          <w:hyperlink w:anchor="_Toc234847856" w:history="1">
+          <w:hyperlink w:anchor="_Toc235270975" w:history="1">
             <w:r>
               <w:rPr>
                 <w:rStyle w:val="Hyperlink"/>
@@ -3056,7 +3312,7 @@
               <w:rPr>
                 <w:noProof/>
               </w:rPr>
-              <w:instrText xml:space="preserve"> PAGEREF _Toc234847856 \h </w:instrText>
+              <w:instrText xml:space="preserve"> PAGEREF _Toc235270975 \h </w:instrText>
             </w:r>
             <w:r>
               <w:rPr>
@@ -3073,7 +3329,7 @@
               <w:rPr>
                 <w:noProof/>
               </w:rPr>
-              <w:t>15</w:t>
+              <w:t>16</w:t>
             </w:r>
             <w:r>
               <w:rPr>
@@ -3093,7 +3349,7 @@
               <w:noProof/>
             </w:rPr>
           </w:pPr>
-          <w:hyperlink w:anchor="_Toc234847857" w:history="1">
+          <w:hyperlink w:anchor="_Toc235270976" w:history="1">
             <w:r>
               <w:rPr>
                 <w:rStyle w:val="Hyperlink"/>
@@ -3120,7 +3376,7 @@
               <w:rPr>
                 <w:noProof/>
               </w:rPr>
-              <w:instrText xml:space="preserve"> PAGEREF _Toc234847857 \h </w:instrText>
+              <w:instrText xml:space="preserve"> PAGEREF _Toc235270976 \h </w:instrText>
             </w:r>
             <w:r>
               <w:rPr>
@@ -3137,7 +3393,7 @@
               <w:rPr>
                 <w:noProof/>
               </w:rPr>
-              <w:t>15</w:t>
+              <w:t>16</w:t>
             </w:r>
             <w:r>
               <w:rPr>
@@ -3157,7 +3413,7 @@
               <w:noProof/>
             </w:rPr>
           </w:pPr>
-          <w:hyperlink w:anchor="_Toc234847858" w:history="1">
+          <w:hyperlink w:anchor="_Toc235270977" w:history="1">
             <w:r>
               <w:rPr>
                 <w:rStyle w:val="Hyperlink"/>
@@ -3184,7 +3440,7 @@
               <w:rPr>
                 <w:noProof/>
               </w:rPr>
-              <w:instrText xml:space="preserve"> PAGEREF _Toc234847858 \h </w:instrText>
+              <w:instrText xml:space="preserve"> PAGEREF _Toc235270977 \h </w:instrText>
             </w:r>
             <w:r>
               <w:rPr>
@@ -3201,7 +3457,7 @@
               <w:rPr>
                 <w:noProof/>
               </w:rPr>
-              <w:t>15</w:t>
+              <w:t>16</w:t>
             </w:r>
             <w:r>
               <w:rPr>
@@ -3221,7 +3477,7 @@
               <w:noProof/>
             </w:rPr>
           </w:pPr>
-          <w:hyperlink w:anchor="_Toc234847859" w:history="1">
+          <w:hyperlink w:anchor="_Toc235270978" w:history="1">
             <w:r>
               <w:rPr>
                 <w:rStyle w:val="Hyperlink"/>
@@ -3248,7 +3504,7 @@
               <w:rPr>
                 <w:noProof/>
               </w:rPr>
-              <w:instrText xml:space="preserve"> PAGEREF _Toc234847859 \h </w:instrText>
+              <w:instrText xml:space="preserve"> PAGEREF _Toc235270978 \h </w:instrText>
             </w:r>
             <w:r>
               <w:rPr>
@@ -3265,7 +3521,7 @@
               <w:rPr>
                 <w:noProof/>
               </w:rPr>
-              <w:t>15</w:t>
+              <w:t>16</w:t>
             </w:r>
             <w:r>
               <w:rPr>
@@ -3285,7 +3541,7 @@
               <w:noProof/>
             </w:rPr>
           </w:pPr>
-          <w:hyperlink w:anchor="_Toc234847860" w:history="1">
+          <w:hyperlink w:anchor="_Toc235270979" w:history="1">
             <w:r>
               <w:rPr>
                 <w:rStyle w:val="Hyperlink"/>
@@ -3312,7 +3568,7 @@
               <w:rPr>
                 <w:noProof/>
               </w:rPr>
-              <w:instrText xml:space="preserve"> PAGEREF _Toc234847860 \h </w:instrText>
+              <w:instrText xml:space="preserve"> PAGEREF _Toc235270979 \h </w:instrText>
             </w:r>
             <w:r>
               <w:rPr>
@@ -3329,7 +3585,7 @@
               <w:rPr>
                 <w:noProof/>
               </w:rPr>
-              <w:t>16</w:t>
+              <w:t>17</w:t>
             </w:r>
             <w:r>
               <w:rPr>
@@ -3349,7 +3605,7 @@
               <w:noProof/>
             </w:rPr>
           </w:pPr>
-          <w:hyperlink w:anchor="_Toc234847861" w:history="1">
+          <w:hyperlink w:anchor="_Toc235270980" w:history="1">
             <w:r>
               <w:rPr>
                 <w:rStyle w:val="Hyperlink"/>
@@ -3376,7 +3632,7 @@
               <w:rPr>
                 <w:noProof/>
               </w:rPr>
-              <w:instrText xml:space="preserve"> PAGEREF _Toc234847861 \h </w:instrText>
+              <w:instrText xml:space="preserve"> PAGEREF _Toc235270980 \h </w:instrText>
             </w:r>
             <w:r>
               <w:rPr>
@@ -3393,7 +3649,7 @@
               <w:rPr>
                 <w:noProof/>
               </w:rPr>
-              <w:t>16</w:t>
+              <w:t>17</w:t>
             </w:r>
             <w:r>
               <w:rPr>
@@ -3413,7 +3669,7 @@
               <w:noProof/>
             </w:rPr>
           </w:pPr>
-          <w:hyperlink w:anchor="_Toc234847862" w:history="1">
+          <w:hyperlink w:anchor="_Toc235270981" w:history="1">
             <w:r>
               <w:rPr>
                 <w:rStyle w:val="Hyperlink"/>
@@ -3440,7 +3696,7 @@
               <w:rPr>
                 <w:noProof/>
               </w:rPr>
-              <w:instrText xml:space="preserve"> PAGEREF _Toc234847862 \h </w:instrText>
+              <w:instrText xml:space="preserve"> PAGEREF _Toc235270981 \h </w:instrText>
             </w:r>
             <w:r>
               <w:rPr>
@@ -3457,7 +3713,7 @@
               <w:rPr>
                 <w:noProof/>
               </w:rPr>
-              <w:t>16</w:t>
+              <w:t>17</w:t>
             </w:r>
             <w:r>
               <w:rPr>
@@ -3477,7 +3733,7 @@
               <w:noProof/>
             </w:rPr>
           </w:pPr>
-          <w:hyperlink w:anchor="_Toc234847863" w:history="1">
+          <w:hyperlink w:anchor="_Toc235270982" w:history="1">
             <w:r>
               <w:rPr>
                 <w:rStyle w:val="Hyperlink"/>
@@ -3504,7 +3760,7 @@
               <w:rPr>
                 <w:noProof/>
               </w:rPr>
-              <w:instrText xml:space="preserve"> PAGEREF _Toc234847863 \h </w:instrText>
+              <w:instrText xml:space="preserve"> PAGEREF _Toc235270982 \h </w:instrText>
             </w:r>
             <w:r>
               <w:rPr>
@@ -3521,7 +3777,7 @@
               <w:rPr>
                 <w:noProof/>
               </w:rPr>
-              <w:t>16</w:t>
+              <w:t>17</w:t>
             </w:r>
             <w:r>
               <w:rPr>
@@ -3541,7 +3797,7 @@
               <w:noProof/>
             </w:rPr>
           </w:pPr>
-          <w:hyperlink w:anchor="_Toc234847864" w:history="1">
+          <w:hyperlink w:anchor="_Toc235270983" w:history="1">
             <w:r>
               <w:rPr>
                 <w:rStyle w:val="Hyperlink"/>
@@ -3568,7 +3824,7 @@
               <w:rPr>
                 <w:noProof/>
               </w:rPr>
-              <w:instrText xml:space="preserve"> PAGEREF _Toc234847864 \h </w:instrText>
+              <w:instrText xml:space="preserve"> PAGEREF _Toc235270983 \h </w:instrText>
             </w:r>
             <w:r>
               <w:rPr>
@@ -3585,7 +3841,7 @@
               <w:rPr>
                 <w:noProof/>
               </w:rPr>
-              <w:t>16</w:t>
+              <w:t>17</w:t>
             </w:r>
             <w:r>
               <w:rPr>
@@ -3605,7 +3861,7 @@
               <w:noProof/>
             </w:rPr>
           </w:pPr>
-          <w:hyperlink w:anchor="_Toc234847865" w:history="1">
+          <w:hyperlink w:anchor="_Toc235270984" w:history="1">
             <w:r>
               <w:rPr>
                 <w:rStyle w:val="Hyperlink"/>
@@ -3632,7 +3888,7 @@
               <w:rPr>
                 <w:noProof/>
               </w:rPr>
-              <w:instrText xml:space="preserve"> PAGEREF _Toc234847865 \h </w:instrText>
+              <w:instrText xml:space="preserve"> PAGEREF _Toc235270984 \h </w:instrText>
             </w:r>
             <w:r>
               <w:rPr>
@@ -3649,7 +3905,7 @@
               <w:rPr>
                 <w:noProof/>
               </w:rPr>
-              <w:t>17</w:t>
+              <w:t>18</w:t>
             </w:r>
             <w:r>
               <w:rPr>
@@ -3669,7 +3925,7 @@
               <w:noProof/>
             </w:rPr>
           </w:pPr>
-          <w:hyperlink w:anchor="_Toc234847866" w:history="1">
+          <w:hyperlink w:anchor="_Toc235270985" w:history="1">
             <w:r>
               <w:rPr>
                 <w:rStyle w:val="Hyperlink"/>
@@ -3696,7 +3952,7 @@
               <w:rPr>
                 <w:noProof/>
               </w:rPr>
-              <w:instrText xml:space="preserve"> PAGEREF _Toc234847866 \h </w:instrText>
+              <w:instrText xml:space="preserve"> PAGEREF _Toc235270985 \h </w:instrText>
             </w:r>
             <w:r>
               <w:rPr>
@@ -3713,7 +3969,7 @@
               <w:rPr>
                 <w:noProof/>
               </w:rPr>
-              <w:t>17</w:t>
+              <w:t>18</w:t>
             </w:r>
             <w:r>
               <w:rPr>
@@ -3733,7 +3989,7 @@
               <w:noProof/>
             </w:rPr>
           </w:pPr>
-          <w:hyperlink w:anchor="_Toc234847867" w:history="1">
+          <w:hyperlink w:anchor="_Toc235270986" w:history="1">
             <w:r>
               <w:rPr>
                 <w:rStyle w:val="Hyperlink"/>
@@ -3760,7 +4016,7 @@
               <w:rPr>
                 <w:noProof/>
               </w:rPr>
-              <w:instrText xml:space="preserve"> PAGEREF _Toc234847867 \h </w:instrText>
+              <w:instrText xml:space="preserve"> PAGEREF _Toc235270986 \h </w:instrText>
             </w:r>
             <w:r>
               <w:rPr>
@@ -3777,7 +4033,7 @@
               <w:rPr>
                 <w:noProof/>
               </w:rPr>
-              <w:t>17</w:t>
+              <w:t>18</w:t>
             </w:r>
             <w:r>
               <w:rPr>
@@ -3797,7 +4053,7 @@
               <w:noProof/>
             </w:rPr>
           </w:pPr>
-          <w:hyperlink w:anchor="_Toc234847868" w:history="1">
+          <w:hyperlink w:anchor="_Toc235270987" w:history="1">
             <w:r>
               <w:rPr>
                 <w:rStyle w:val="Hyperlink"/>
@@ -3824,7 +4080,7 @@
               <w:rPr>
                 <w:noProof/>
               </w:rPr>
-              <w:instrText xml:space="preserve"> PAGEREF _Toc234847868 \h </w:instrText>
+              <w:instrText xml:space="preserve"> PAGEREF _Toc235270987 \h </w:instrText>
             </w:r>
             <w:r>
               <w:rPr>
@@ -3841,7 +4097,7 @@
               <w:rPr>
                 <w:noProof/>
               </w:rPr>
-              <w:t>17</w:t>
+              <w:t>18</w:t>
             </w:r>
             <w:r>
               <w:rPr>
@@ -3871,7 +4127,7 @@
         </w:pBdr>
         <w:spacing w:before="480" w:after="160"/>
       </w:pPr>
-      <w:bookmarkStart w:id="1" w:name="_Toc234847812"/>
+      <w:bookmarkStart w:id="1" w:name="_Toc235270927"/>
       <w:r>
         <w:rPr>
           <w:rFonts w:ascii="Arial" w:eastAsia="Arial" w:hAnsi="Arial" w:cs="Arial"/>
@@ -3891,7 +4147,7 @@
         <w:pStyle w:val="Heading2"/>
         <w:spacing w:before="280" w:after="100"/>
       </w:pPr>
-      <w:bookmarkStart w:id="2" w:name="_Toc234847813"/>
+      <w:bookmarkStart w:id="2" w:name="_Toc235270928"/>
       <w:r>
         <w:rPr>
           <w:rFonts w:ascii="Arial" w:eastAsia="Arial" w:hAnsi="Arial" w:cs="Arial"/>
@@ -3928,7 +4184,7 @@
         <w:pStyle w:val="Heading2"/>
         <w:spacing w:before="280" w:after="100"/>
       </w:pPr>
-      <w:bookmarkStart w:id="3" w:name="_Toc234847814"/>
+      <w:bookmarkStart w:id="3" w:name="_Toc235270929"/>
       <w:r>
         <w:rPr>
           <w:rFonts w:ascii="Arial" w:eastAsia="Arial" w:hAnsi="Arial" w:cs="Arial"/>
@@ -3973,7 +4229,7 @@
         <w:pStyle w:val="Heading2"/>
         <w:spacing w:before="280" w:after="100"/>
       </w:pPr>
-      <w:bookmarkStart w:id="4" w:name="_Toc234847815"/>
+      <w:bookmarkStart w:id="4" w:name="_Toc235270930"/>
       <w:r>
         <w:rPr>
           <w:rFonts w:ascii="Arial" w:eastAsia="Arial" w:hAnsi="Arial" w:cs="Arial"/>
@@ -4022,7 +4278,7 @@
         <w:t xml:space="preserve">NOTE: </w:t>
       </w:r>
       <w:r>
-        <w:t>Two genuinely independent data paths feed the system: a LoRa radio link (sensor to a local receiver) and a Blues Notecard cellular link (sensor directly to Blues Notehub.io, then via webhook into tide.py). A station may use either or both, and they do not share any hardware or software path between the sensor and tide.py. See Section 3.2 for the data-flow diagram.</w:t>
+        <w:t>Two genuinely independent data paths feed the system: a LoRa radio link (sensor to a local receiver) and a Blues Notecard cellular link (sensor directly to Blues Notehub.io, then via webhook into tide.py). A station may use either or both, and they do not share any hardware or software path between the sensor and tide.py. See Section 3.2 for the corrected data-flow diagram.</w:t>
       </w:r>
     </w:p>
     <w:p>
@@ -4038,7 +4294,7 @@
         </w:pBdr>
         <w:spacing w:before="480" w:after="160"/>
       </w:pPr>
-      <w:bookmarkStart w:id="5" w:name="_Toc234847816"/>
+      <w:bookmarkStart w:id="5" w:name="_Toc235270931"/>
       <w:r>
         <w:rPr>
           <w:rFonts w:ascii="Arial" w:eastAsia="Arial" w:hAnsi="Arial" w:cs="Arial"/>
@@ -4087,7 +4343,7 @@
         <w:pStyle w:val="Heading2"/>
         <w:spacing w:before="280" w:after="100"/>
       </w:pPr>
-      <w:bookmarkStart w:id="6" w:name="_Toc234847817"/>
+      <w:bookmarkStart w:id="6" w:name="_Toc235270932"/>
       <w:r>
         <w:rPr>
           <w:rFonts w:ascii="Arial" w:eastAsia="Arial" w:hAnsi="Arial" w:cs="Arial"/>
@@ -4226,7 +4482,7 @@
         <w:pStyle w:val="Heading2"/>
         <w:spacing w:before="280" w:after="100"/>
       </w:pPr>
-      <w:bookmarkStart w:id="7" w:name="_Toc234847818"/>
+      <w:bookmarkStart w:id="7" w:name="_Toc235270933"/>
       <w:r>
         <w:rPr>
           <w:rFonts w:ascii="Arial" w:eastAsia="Arial" w:hAnsi="Arial" w:cs="Arial"/>
@@ -4319,7 +4575,7 @@
         <w:pStyle w:val="Heading2"/>
         <w:spacing w:before="280" w:after="100"/>
       </w:pPr>
-      <w:bookmarkStart w:id="8" w:name="_Toc234847819"/>
+      <w:bookmarkStart w:id="8" w:name="_Toc235270934"/>
       <w:r>
         <w:rPr>
           <w:rFonts w:ascii="Arial" w:eastAsia="Arial" w:hAnsi="Arial" w:cs="Arial"/>
@@ -4338,7 +4594,7 @@
         <w:pStyle w:val="Heading3"/>
         <w:spacing w:before="200" w:after="80"/>
       </w:pPr>
-      <w:bookmarkStart w:id="9" w:name="_Toc234847820"/>
+      <w:bookmarkStart w:id="9" w:name="_Toc235270935"/>
       <w:r>
         <w:rPr>
           <w:rFonts w:ascii="Arial" w:eastAsia="Arial" w:hAnsi="Arial" w:cs="Arial"/>
@@ -4419,7 +4675,7 @@
         <w:pStyle w:val="Heading3"/>
         <w:spacing w:before="200" w:after="80"/>
       </w:pPr>
-      <w:bookmarkStart w:id="10" w:name="_Toc234847821"/>
+      <w:bookmarkStart w:id="10" w:name="_Toc235270936"/>
       <w:r>
         <w:rPr>
           <w:rFonts w:ascii="Arial" w:eastAsia="Arial" w:hAnsi="Arial" w:cs="Arial"/>
@@ -4528,7 +4784,7 @@
         <w:pStyle w:val="Heading3"/>
         <w:spacing w:before="200" w:after="80"/>
       </w:pPr>
-      <w:bookmarkStart w:id="11" w:name="_Toc234847822"/>
+      <w:bookmarkStart w:id="11" w:name="_Toc235270937"/>
       <w:r>
         <w:rPr>
           <w:rFonts w:ascii="Arial" w:eastAsia="Arial" w:hAnsi="Arial" w:cs="Arial"/>
@@ -4663,7 +4919,7 @@
         <w:pStyle w:val="Heading2"/>
         <w:spacing w:before="280" w:after="100"/>
       </w:pPr>
-      <w:bookmarkStart w:id="12" w:name="_Toc234847823"/>
+      <w:bookmarkStart w:id="12" w:name="_Toc235270938"/>
       <w:r>
         <w:rPr>
           <w:rFonts w:ascii="Arial" w:eastAsia="Arial" w:hAnsi="Arial" w:cs="Arial"/>
@@ -4783,7 +5039,7 @@
         <w:pStyle w:val="Heading2"/>
         <w:spacing w:before="280" w:after="100"/>
       </w:pPr>
-      <w:bookmarkStart w:id="13" w:name="_Toc234847824"/>
+      <w:bookmarkStart w:id="13" w:name="_Toc235270939"/>
       <w:r>
         <w:rPr>
           <w:rFonts w:ascii="Arial" w:eastAsia="Arial" w:hAnsi="Arial" w:cs="Arial"/>
@@ -4882,7 +5138,7 @@
         <w:pStyle w:val="Heading2"/>
         <w:spacing w:before="280" w:after="100"/>
       </w:pPr>
-      <w:bookmarkStart w:id="14" w:name="_Toc234847825"/>
+      <w:bookmarkStart w:id="14" w:name="_Toc235270940"/>
       <w:r>
         <w:rPr>
           <w:rFonts w:ascii="Arial" w:eastAsia="Arial" w:hAnsi="Arial" w:cs="Arial"/>
@@ -4901,32 +5157,7 @@
         <w:spacing w:before="60" w:after="100"/>
       </w:pPr>
       <w:r>
-        <w:t xml:space="preserve">For issues that aren't resolved by a service restart or reboot, or that involve any of the caution items above, escalate to the system's maintainer rather than attempting further changes. </w:t>
-      </w:r>
-      <w:r>
-        <w:t xml:space="preserve">Contact </w:t>
-      </w:r>
-      <w:hyperlink r:id="rId7" w:history="1">
-        <w:r>
-          <w:rPr>
-            <w:rStyle w:val="Hyperlink"/>
-          </w:rPr>
-          <w:t>cfi1513840@gmail.com</w:t>
-        </w:r>
-      </w:hyperlink>
-      <w:r>
-        <w:t xml:space="preserve"> or </w:t>
-      </w:r>
-      <w:hyperlink r:id="rId8" w:history="1">
-        <w:r>
-          <w:rPr>
-            <w:rStyle w:val="Hyperlink"/>
-          </w:rPr>
-          <w:t>David.Sprague@gmail.com</w:t>
-        </w:r>
-      </w:hyperlink>
-      <w:r>
-        <w:t xml:space="preserve"> for further assistance.</w:t>
+        <w:t>For issues that aren't resolved by a service restart or reboot, or that involve any of the caution items above, escalate to the system's maintainer rather than attempting further changes. [Ken: insert the actual contact path you want documented here -- e.g., your own contact info, your colleague's, or a shared point of contact, along with any expected response-time expectation for an autonomous site like Lincoln Academy.]</w:t>
       </w:r>
     </w:p>
     <w:p>
@@ -4942,7 +5173,7 @@
         </w:pBdr>
         <w:spacing w:before="480" w:after="160"/>
       </w:pPr>
-      <w:bookmarkStart w:id="15" w:name="_Toc234847826"/>
+      <w:bookmarkStart w:id="15" w:name="_Toc235270941"/>
       <w:r>
         <w:rPr>
           <w:rFonts w:ascii="Arial" w:eastAsia="Arial" w:hAnsi="Arial" w:cs="Arial"/>
@@ -4962,7 +5193,7 @@
         <w:pStyle w:val="Heading2"/>
         <w:spacing w:before="280" w:after="100"/>
       </w:pPr>
-      <w:bookmarkStart w:id="16" w:name="_Toc234847827"/>
+      <w:bookmarkStart w:id="16" w:name="_Toc235270942"/>
       <w:r>
         <w:rPr>
           <w:rFonts w:ascii="Arial" w:eastAsia="Arial" w:hAnsi="Arial" w:cs="Arial"/>
@@ -4990,7 +5221,7 @@
         <w:pStyle w:val="Heading2"/>
         <w:spacing w:before="280" w:after="100"/>
       </w:pPr>
-      <w:bookmarkStart w:id="17" w:name="_Toc234847828"/>
+      <w:bookmarkStart w:id="17" w:name="_Toc235270943"/>
       <w:r>
         <w:rPr>
           <w:rFonts w:ascii="Arial" w:eastAsia="Arial" w:hAnsi="Arial" w:cs="Arial"/>
@@ -5018,7 +5249,7 @@
         <w:pStyle w:val="Heading3"/>
         <w:spacing w:before="200" w:after="80"/>
       </w:pPr>
-      <w:bookmarkStart w:id="18" w:name="_Toc234847829"/>
+      <w:bookmarkStart w:id="18" w:name="_Toc235270944"/>
       <w:r>
         <w:rPr>
           <w:rFonts w:ascii="Arial" w:eastAsia="Arial" w:hAnsi="Arial" w:cs="Arial"/>
@@ -5054,7 +5285,7 @@
         <w:pStyle w:val="Heading3"/>
         <w:spacing w:before="200" w:after="80"/>
       </w:pPr>
-      <w:bookmarkStart w:id="19" w:name="_Toc234847830"/>
+      <w:bookmarkStart w:id="19" w:name="_Toc235270945"/>
       <w:r>
         <w:rPr>
           <w:rFonts w:ascii="Arial" w:eastAsia="Arial" w:hAnsi="Arial" w:cs="Arial"/>
@@ -5145,41 +5376,23 @@
         <w:t xml:space="preserve">NOTE: </w:t>
       </w:r>
       <w:r>
-        <w:t xml:space="preserve">These two paths do not share any component between the sensor and tide.py -- not the receiving hardware, not the transport protocol, not the software module. A station's </w:t>
-      </w:r>
-      <w:r>
-        <w:t>sensor type</w:t>
-      </w:r>
-      <w:r>
-        <w:t xml:space="preserve"> setting </w:t>
-      </w:r>
-      <w:r>
-        <w:t>(</w:t>
+        <w:t xml:space="preserve">These two paths do not share any component between the sensor and tide.py -- not the receiving hardware, not the transport protocol, not the software module. A station's SENSOR_SOURCE setting in </w:t>
       </w:r>
       <w:proofErr w:type="spellStart"/>
       <w:r>
-        <w:t>sntype</w:t>
+        <w:t>tide.env</w:t>
       </w:r>
       <w:proofErr w:type="spellEnd"/>
       <w:r>
-        <w:t xml:space="preserve">) </w:t>
-      </w:r>
-      <w:r>
-        <w:t xml:space="preserve">in </w:t>
-      </w:r>
-      <w:r>
-        <w:t xml:space="preserve">the SQLite3 </w:t>
+        <w:t xml:space="preserve"> ('lora' or '</w:t>
       </w:r>
       <w:proofErr w:type="spellStart"/>
       <w:r>
-        <w:t>iparams</w:t>
+        <w:t>notehub</w:t>
       </w:r>
       <w:proofErr w:type="spellEnd"/>
       <w:r>
-        <w:t xml:space="preserve"> table </w:t>
-      </w:r>
-      <w:r>
-        <w:t xml:space="preserve">('lora' or 'note') reflects which path a given deployment </w:t>
+        <w:t xml:space="preserve">') reflects which path a given deployment </w:t>
       </w:r>
       <w:proofErr w:type="gramStart"/>
       <w:r>
@@ -5187,7 +5400,7 @@
       </w:r>
       <w:proofErr w:type="gramEnd"/>
       <w:r>
-        <w:t xml:space="preserve">. </w:t>
+        <w:t>. An earlier version of this manual's architecture diagram incorrectly showed both paths converging through the LoRa receiver; that has been corrected here.</w:t>
       </w:r>
     </w:p>
     <w:p>
@@ -5195,7 +5408,7 @@
         <w:pStyle w:val="Heading2"/>
         <w:spacing w:before="280" w:after="100"/>
       </w:pPr>
-      <w:bookmarkStart w:id="20" w:name="_Toc234847831"/>
+      <w:bookmarkStart w:id="20" w:name="_Toc235270946"/>
       <w:r>
         <w:rPr>
           <w:rFonts w:ascii="Arial" w:eastAsia="Arial" w:hAnsi="Arial" w:cs="Arial"/>
@@ -5271,7 +5484,7 @@
         </w:pBdr>
         <w:spacing w:before="480" w:after="160"/>
       </w:pPr>
-      <w:bookmarkStart w:id="21" w:name="_Toc234847832"/>
+      <w:bookmarkStart w:id="21" w:name="_Toc235270947"/>
       <w:r>
         <w:rPr>
           <w:rFonts w:ascii="Arial" w:eastAsia="Arial" w:hAnsi="Arial" w:cs="Arial"/>
@@ -5291,7 +5504,7 @@
         <w:pStyle w:val="Heading2"/>
         <w:spacing w:before="280" w:after="100"/>
       </w:pPr>
-      <w:bookmarkStart w:id="22" w:name="_Toc234847833"/>
+      <w:bookmarkStart w:id="22" w:name="_Toc235270948"/>
       <w:r>
         <w:rPr>
           <w:rFonts w:ascii="Arial" w:eastAsia="Arial" w:hAnsi="Arial" w:cs="Arial"/>
@@ -5655,7 +5868,7 @@
         <w:pStyle w:val="Heading2"/>
         <w:spacing w:before="280" w:after="100"/>
       </w:pPr>
-      <w:bookmarkStart w:id="23" w:name="_Toc234847834"/>
+      <w:bookmarkStart w:id="23" w:name="_Toc235270949"/>
       <w:r>
         <w:rPr>
           <w:rFonts w:ascii="Arial" w:eastAsia="Arial" w:hAnsi="Arial" w:cs="Arial"/>
@@ -6074,7 +6287,7 @@
         </w:pBdr>
         <w:spacing w:before="480" w:after="160"/>
       </w:pPr>
-      <w:bookmarkStart w:id="24" w:name="_Toc234847835"/>
+      <w:bookmarkStart w:id="24" w:name="_Toc235270950"/>
       <w:r>
         <w:rPr>
           <w:rFonts w:ascii="Arial" w:eastAsia="Arial" w:hAnsi="Arial" w:cs="Arial"/>
@@ -6103,7 +6316,7 @@
         <w:pStyle w:val="Heading2"/>
         <w:spacing w:before="280" w:after="100"/>
       </w:pPr>
-      <w:bookmarkStart w:id="25" w:name="_Toc234847836"/>
+      <w:bookmarkStart w:id="25" w:name="_Toc235270951"/>
       <w:r>
         <w:rPr>
           <w:rFonts w:ascii="Arial" w:eastAsia="Arial" w:hAnsi="Arial" w:cs="Arial"/>
@@ -6988,7 +7201,7 @@
         <w:pStyle w:val="Heading2"/>
         <w:spacing w:before="280" w:after="100"/>
       </w:pPr>
-      <w:bookmarkStart w:id="26" w:name="_Toc234847837"/>
+      <w:bookmarkStart w:id="26" w:name="_Toc235270952"/>
       <w:r>
         <w:rPr>
           <w:rFonts w:ascii="Arial" w:eastAsia="Arial" w:hAnsi="Arial" w:cs="Arial"/>
@@ -7141,7 +7354,7 @@
         </w:pBdr>
         <w:spacing w:before="480" w:after="160"/>
       </w:pPr>
-      <w:bookmarkStart w:id="27" w:name="_Toc234847838"/>
+      <w:bookmarkStart w:id="27" w:name="_Toc235270953"/>
       <w:r>
         <w:rPr>
           <w:rFonts w:ascii="Arial" w:eastAsia="Arial" w:hAnsi="Arial" w:cs="Arial"/>
@@ -7161,7 +7374,7 @@
         <w:pStyle w:val="Heading2"/>
         <w:spacing w:before="280" w:after="100"/>
       </w:pPr>
-      <w:bookmarkStart w:id="28" w:name="_Toc234847839"/>
+      <w:bookmarkStart w:id="28" w:name="_Toc235270954"/>
       <w:r>
         <w:rPr>
           <w:rFonts w:ascii="Arial" w:eastAsia="Arial" w:hAnsi="Arial" w:cs="Arial"/>
@@ -7746,13 +7959,7 @@
       </w:r>
       <w:proofErr w:type="spellEnd"/>
       <w:r>
-        <w:t xml:space="preserve">) specifically </w:t>
-      </w:r>
-      <w:r>
-        <w:t xml:space="preserve">for the use of tideplot.py and </w:t>
-      </w:r>
-      <w:r>
-        <w:t xml:space="preserve">so ad hoc queries and diagnostics can be run without risking lock contention against </w:t>
+        <w:t xml:space="preserve">) specifically so ad hoc queries and diagnostics can be run without risking lock contention against </w:t>
       </w:r>
       <w:proofErr w:type="spellStart"/>
       <w:r>
@@ -7768,7 +7975,7 @@
         <w:pStyle w:val="Heading2"/>
         <w:spacing w:before="280" w:after="100"/>
       </w:pPr>
-      <w:bookmarkStart w:id="29" w:name="_Toc234847840"/>
+      <w:bookmarkStart w:id="29" w:name="_Toc235270955"/>
       <w:r>
         <w:rPr>
           <w:rFonts w:ascii="Arial" w:eastAsia="Arial" w:hAnsi="Arial" w:cs="Arial"/>
@@ -7803,7 +8010,7 @@
         </w:pBdr>
         <w:spacing w:before="480" w:after="160"/>
       </w:pPr>
-      <w:bookmarkStart w:id="30" w:name="_Toc234847841"/>
+      <w:bookmarkStart w:id="30" w:name="_Toc235270956"/>
       <w:r>
         <w:rPr>
           <w:rFonts w:ascii="Arial" w:eastAsia="Arial" w:hAnsi="Arial" w:cs="Arial"/>
@@ -7823,7 +8030,7 @@
         <w:pStyle w:val="Heading2"/>
         <w:spacing w:before="280" w:after="100"/>
       </w:pPr>
-      <w:bookmarkStart w:id="31" w:name="_Toc234847842"/>
+      <w:bookmarkStart w:id="31" w:name="_Toc235270957"/>
       <w:r>
         <w:rPr>
           <w:rFonts w:ascii="Arial" w:eastAsia="Arial" w:hAnsi="Arial" w:cs="Arial"/>
@@ -8225,7 +8432,7 @@
         <w:pStyle w:val="Heading2"/>
         <w:spacing w:before="280" w:after="100"/>
       </w:pPr>
-      <w:bookmarkStart w:id="32" w:name="_Toc234847843"/>
+      <w:bookmarkStart w:id="32" w:name="_Toc235270958"/>
       <w:r>
         <w:rPr>
           <w:rFonts w:ascii="Arial" w:eastAsia="Arial" w:hAnsi="Arial" w:cs="Arial"/>
@@ -8278,7 +8485,7 @@
         <w:pStyle w:val="Heading2"/>
         <w:spacing w:before="280" w:after="100"/>
       </w:pPr>
-      <w:bookmarkStart w:id="33" w:name="_Toc234847844"/>
+      <w:bookmarkStart w:id="33" w:name="_Toc235270959"/>
       <w:r>
         <w:rPr>
           <w:rFonts w:ascii="Arial" w:eastAsia="Arial" w:hAnsi="Arial" w:cs="Arial"/>
@@ -8338,7 +8545,7 @@
         <w:pStyle w:val="Heading2"/>
         <w:spacing w:before="280" w:after="100"/>
       </w:pPr>
-      <w:bookmarkStart w:id="34" w:name="_Toc234847845"/>
+      <w:bookmarkStart w:id="34" w:name="_Toc235270960"/>
       <w:r>
         <w:rPr>
           <w:rFonts w:ascii="Arial" w:eastAsia="Arial" w:hAnsi="Arial" w:cs="Arial"/>
@@ -8406,7 +8613,7 @@
         </w:pBdr>
         <w:spacing w:before="480" w:after="160"/>
       </w:pPr>
-      <w:bookmarkStart w:id="35" w:name="_Toc234847846"/>
+      <w:bookmarkStart w:id="35" w:name="_Toc235270961"/>
       <w:r>
         <w:rPr>
           <w:rFonts w:ascii="Arial" w:eastAsia="Arial" w:hAnsi="Arial" w:cs="Arial"/>
@@ -8426,7 +8633,7 @@
         <w:pStyle w:val="Heading2"/>
         <w:spacing w:before="280" w:after="100"/>
       </w:pPr>
-      <w:bookmarkStart w:id="36" w:name="_Toc234847847"/>
+      <w:bookmarkStart w:id="36" w:name="_Toc235270962"/>
       <w:r>
         <w:rPr>
           <w:rFonts w:ascii="Arial" w:eastAsia="Arial" w:hAnsi="Arial" w:cs="Arial"/>
@@ -8454,7 +8661,7 @@
         <w:pStyle w:val="Heading2"/>
         <w:spacing w:before="280" w:after="100"/>
       </w:pPr>
-      <w:bookmarkStart w:id="37" w:name="_Toc234847848"/>
+      <w:bookmarkStart w:id="37" w:name="_Toc235270963"/>
       <w:r>
         <w:rPr>
           <w:rFonts w:ascii="Arial" w:eastAsia="Arial" w:hAnsi="Arial" w:cs="Arial"/>
@@ -8490,7 +8697,7 @@
         <w:pStyle w:val="Heading2"/>
         <w:spacing w:before="280" w:after="100"/>
       </w:pPr>
-      <w:bookmarkStart w:id="38" w:name="_Toc234847849"/>
+      <w:bookmarkStart w:id="38" w:name="_Toc235270964"/>
       <w:r>
         <w:rPr>
           <w:rFonts w:ascii="Arial" w:eastAsia="Arial" w:hAnsi="Arial" w:cs="Arial"/>
@@ -8570,7 +8777,7 @@
         <w:pStyle w:val="Heading2"/>
         <w:spacing w:before="280" w:after="100"/>
       </w:pPr>
-      <w:bookmarkStart w:id="39" w:name="_Toc234847850"/>
+      <w:bookmarkStart w:id="39" w:name="_Toc235270965"/>
       <w:r>
         <w:rPr>
           <w:rFonts w:ascii="Arial" w:eastAsia="Arial" w:hAnsi="Arial" w:cs="Arial"/>
@@ -8597,69 +8804,257 @@
       </w:r>
       <w:proofErr w:type="gramEnd"/>
       <w:r>
-        <w:t xml:space="preserve"> tunnel) is used. </w:t>
-      </w:r>
-      <w:r>
-        <w:t xml:space="preserve">To satisfy this requirement, a Cloudflare.com account must be first established. The account holder must then obtain a URL of choice, </w:t>
-      </w:r>
-      <w:r>
-        <w:t>which</w:t>
-      </w:r>
-      <w:r>
-        <w:t xml:space="preserve"> will be used for all internet access to the station’s generated website pages.</w:t>
-      </w:r>
+        <w:t xml:space="preserve"> tunnel) is used. [Ken: confirm and expand this description -- see the requirements.txt note requesting the exact role of Cloudflare/cloudflared for this deployment.]</w:t>
+      </w:r>
+    </w:p>
+    <w:p>
+      <w:pPr>
+        <w:pStyle w:val="Heading2"/>
+        <w:spacing w:before="280" w:after="100"/>
+      </w:pPr>
+      <w:bookmarkStart w:id="40" w:name="_Toc235270966"/>
+      <w:r>
+        <w:rPr>
+          <w:rFonts w:ascii="Arial" w:eastAsia="Arial" w:hAnsi="Arial" w:cs="Arial"/>
+          <w:b/>
+          <w:bCs/>
+          <w:color w:val="2E7DBE"/>
+          <w:sz w:val="24"/>
+          <w:szCs w:val="24"/>
+        </w:rPr>
+        <w:t>8.5 Site-Specific Customization</w:t>
+      </w:r>
+      <w:bookmarkEnd w:id="40"/>
     </w:p>
     <w:p>
       <w:pPr>
         <w:spacing w:before="60" w:after="100"/>
-      </w:pPr>
-      <w:r>
-        <w:t>The easiest way to implement this</w:t>
-      </w:r>
-      <w:r>
-        <w:t xml:space="preserve"> requirement</w:t>
-      </w:r>
-      <w:r>
-        <w:t xml:space="preserve"> is to purchase the URL through Cloudflare, which will then </w:t>
-      </w:r>
-      <w:r>
-        <w:t>serve as</w:t>
-      </w:r>
-      <w:r>
-        <w:t xml:space="preserve"> the default DNS provider. </w:t>
-      </w:r>
-      <w:r>
-        <w:t>Once the URL is obtained, t</w:t>
-      </w:r>
-      <w:r>
-        <w:t>he Cloudflare.com website provides a configuration wizard to lead</w:t>
-      </w:r>
-      <w:r>
-        <w:t xml:space="preserve"> users through the necessary tunnel configuration steps, including the downloading and installation of the cloudflared service that will become active on the stations </w:t>
+        <w:jc w:val="both"/>
+      </w:pPr>
+      <w:r>
+        <w:t xml:space="preserve">index.html and alertlogin.html are otherwise identical across every station, deliberately -- only three things vary per site, each supplied as a separate </w:t>
+      </w:r>
+      <w:proofErr w:type="gramStart"/>
+      <w:r>
+        <w:t>file</w:t>
+      </w:r>
+      <w:proofErr w:type="gramEnd"/>
+      <w:r>
+        <w:t xml:space="preserve"> so a new deployment never requires editing the shared HTML/CSS/JavaScript itself.</w:t>
+      </w:r>
+    </w:p>
+    <w:p>
+      <w:pPr>
+        <w:pStyle w:val="Heading3"/>
+        <w:spacing w:before="200" w:after="80"/>
+      </w:pPr>
+      <w:bookmarkStart w:id="41" w:name="_Toc235270967"/>
+      <w:r>
+        <w:rPr>
+          <w:rFonts w:ascii="Arial" w:eastAsia="Arial" w:hAnsi="Arial" w:cs="Arial"/>
+          <w:b/>
+          <w:bCs/>
+          <w:color w:val="222222"/>
+          <w:sz w:val="21"/>
+          <w:szCs w:val="21"/>
+        </w:rPr>
+        <w:t>webimage.png</w:t>
+      </w:r>
+      <w:bookmarkEnd w:id="41"/>
+    </w:p>
+    <w:p>
+      <w:pPr>
+        <w:spacing w:before="60" w:after="100"/>
+        <w:jc w:val="both"/>
+      </w:pPr>
+      <w:r>
+        <w:t>The station's own photo, displayed on both index.html and alertlogin.html. Every page that displays it specifies the SAME 8:5 (1.6:1) aspect ratio in its &lt;</w:t>
       </w:r>
       <w:proofErr w:type="spellStart"/>
       <w:r>
-        <w:t>RaspBerry</w:t>
+        <w:t>img</w:t>
       </w:r>
       <w:proofErr w:type="spellEnd"/>
       <w:r>
-        <w:t xml:space="preserve"> Pi host machine. This service is used to establish the link to the Cloudflare network account, identified by the specified tunnel name. The final step of the Cloudflare tunnel configuration is linking the tunnel to the previously mentioned URL, tailored to each specific identity, </w:t>
+        <w:t>&gt; width/height attributes -- alertlogin.html at 480x300, index.html at 560x350. Because every page shares this ratio, the browser only ever needs to scale the image uniformly to fit each page's display size; it never crops or stretches it, and no blank letterboxing appears on either side.</w:t>
+      </w:r>
+    </w:p>
+    <w:p>
+      <w:pPr>
+        <w:pBdr>
+          <w:left w:val="single" w:sz="24" w:space="0" w:color="B5473F"/>
+        </w:pBdr>
+        <w:shd w:val="clear" w:color="auto" w:fill="FCEBEA"/>
+        <w:spacing w:before="100" w:after="140"/>
+        <w:ind w:left="200"/>
+      </w:pPr>
+      <w:r>
+        <w:rPr>
+          <w:b/>
+          <w:bCs/>
+          <w:color w:val="B5473F"/>
+        </w:rPr>
+        <w:t xml:space="preserve">CAUTION: </w:t>
+      </w:r>
+      <w:r>
+        <w:t xml:space="preserve">This only holds because every page is deliberately kept at the same 8:5 ratio. If a future page ever specified a different </w:t>
+      </w:r>
+      <w:proofErr w:type="spellStart"/>
+      <w:r>
+        <w:t>width:height</w:t>
+      </w:r>
+      <w:proofErr w:type="spellEnd"/>
+      <w:r>
+        <w:t xml:space="preserve"> ratio for this image, the browser's default behavior is to stretch/squash the image to fit those exact dimensions, distorting it -- not to crop or letterbox it automatically. Any new page displaying webimage.png must either match the existing 8:5 </w:t>
       </w:r>
       <w:proofErr w:type="gramStart"/>
       <w:r>
-        <w:t>ssh.&lt;</w:t>
+        <w:t>ratio, or</w:t>
       </w:r>
       <w:proofErr w:type="gramEnd"/>
       <w:r>
-        <w:t>URL Name&gt; for ssh and remote desktop activities, www.&lt;URL Name&gt; for normal http access, and query.&lt;URL Name&gt; for InfluxDB network access.</w:t>
+        <w:t xml:space="preserve"> explicitly use CSS object-fit (cover to crop without distortion, contain to letterbox instead) if a different ratio is genuinely needed.</w:t>
       </w:r>
     </w:p>
     <w:p>
       <w:pPr>
         <w:spacing w:before="60" w:after="100"/>
-      </w:pPr>
-      <w:r>
-        <w:t xml:space="preserve"> </w:t>
+        <w:jc w:val="both"/>
+      </w:pPr>
+      <w:r>
+        <w:t>Supply the source file at 960x600 pixels (exactly double the 8:5 display ratio, so it stays sharp on high-DPI/retina screens while scaling down cleanly on standard displays) rather than at the exact display size. If the original photo isn't already 8:5, crop it to that ratio before saving as webimage.png -- don't rely on the browser to do this correctly, since it will distort rather than crop.</w:t>
+      </w:r>
+    </w:p>
+    <w:p>
+      <w:pPr>
+        <w:pStyle w:val="Heading3"/>
+        <w:spacing w:before="200" w:after="80"/>
+      </w:pPr>
+      <w:bookmarkStart w:id="42" w:name="_Toc235270968"/>
+      <w:r>
+        <w:rPr>
+          <w:rFonts w:ascii="Arial" w:eastAsia="Arial" w:hAnsi="Arial" w:cs="Arial"/>
+          <w:b/>
+          <w:bCs/>
+          <w:color w:val="222222"/>
+          <w:sz w:val="21"/>
+          <w:szCs w:val="21"/>
+        </w:rPr>
+        <w:t>webinfo.txt (optional)</w:t>
+      </w:r>
+      <w:bookmarkEnd w:id="42"/>
+    </w:p>
+    <w:p>
+      <w:pPr>
+        <w:spacing w:before="60" w:after="100"/>
+        <w:jc w:val="both"/>
+      </w:pPr>
+      <w:r>
+        <w:t xml:space="preserve">A short, plain-text description of the station, displayed in an information block on index.html. This file is entirely optional -- if it is not present at /var/www/html/webinfo.txt, the information block does not appear at all (index.html checks for it via a client-side </w:t>
+      </w:r>
+      <w:proofErr w:type="gramStart"/>
+      <w:r>
+        <w:t>fetch(</w:t>
+      </w:r>
+      <w:proofErr w:type="gramEnd"/>
+      <w:r>
+        <w:t>) on page load and fails silently if the file is missing). A generic, non-</w:t>
+      </w:r>
+      <w:r>
+        <w:lastRenderedPageBreak/>
+        <w:t>site-specific version of this file is included in the repository; replace it with station-specific text the same way webimage.png is replaced.</w:t>
+      </w:r>
+    </w:p>
+    <w:p>
+      <w:pPr>
+        <w:pStyle w:val="Heading3"/>
+        <w:spacing w:before="200" w:after="80"/>
+      </w:pPr>
+      <w:bookmarkStart w:id="43" w:name="_Toc235270969"/>
+      <w:r>
+        <w:rPr>
+          <w:rFonts w:ascii="Arial" w:eastAsia="Arial" w:hAnsi="Arial" w:cs="Arial"/>
+          <w:b/>
+          <w:bCs/>
+          <w:color w:val="222222"/>
+          <w:sz w:val="21"/>
+          <w:szCs w:val="21"/>
+        </w:rPr>
+        <w:t>STATION_LOCATION (</w:t>
+      </w:r>
+      <w:proofErr w:type="spellStart"/>
+      <w:r>
+        <w:rPr>
+          <w:rFonts w:ascii="Arial" w:eastAsia="Arial" w:hAnsi="Arial" w:cs="Arial"/>
+          <w:b/>
+          <w:bCs/>
+          <w:color w:val="222222"/>
+          <w:sz w:val="21"/>
+          <w:szCs w:val="21"/>
+        </w:rPr>
+        <w:t>tide.env</w:t>
+      </w:r>
+      <w:proofErr w:type="spellEnd"/>
+      <w:r>
+        <w:rPr>
+          <w:rFonts w:ascii="Arial" w:eastAsia="Arial" w:hAnsi="Arial" w:cs="Arial"/>
+          <w:b/>
+          <w:bCs/>
+          <w:color w:val="222222"/>
+          <w:sz w:val="21"/>
+          <w:szCs w:val="21"/>
+        </w:rPr>
+        <w:t>)</w:t>
+      </w:r>
+      <w:bookmarkEnd w:id="43"/>
+    </w:p>
+    <w:p>
+      <w:pPr>
+        <w:spacing w:before="60" w:after="100"/>
+        <w:jc w:val="both"/>
+      </w:pPr>
+      <w:r>
+        <w:t xml:space="preserve">If set, this existing </w:t>
+      </w:r>
+      <w:proofErr w:type="spellStart"/>
+      <w:r>
+        <w:t>tide.env</w:t>
+      </w:r>
+      <w:proofErr w:type="spellEnd"/>
+      <w:r>
+        <w:t xml:space="preserve"> variable (already used elsewhere for email subject lines and the local monitor panel's title) is also read by a small CGI script, </w:t>
+      </w:r>
+      <w:proofErr w:type="spellStart"/>
+      <w:r>
+        <w:t>sitename.cgi</w:t>
+      </w:r>
+      <w:proofErr w:type="spellEnd"/>
+      <w:r>
+        <w:t xml:space="preserve">, and prepended to </w:t>
+      </w:r>
+      <w:proofErr w:type="spellStart"/>
+      <w:r>
+        <w:t>index.html's</w:t>
+      </w:r>
+      <w:proofErr w:type="spellEnd"/>
+      <w:r>
+        <w:t xml:space="preserve"> title -- for example, 'Belfast Harbor Tide Station Hub' rather than the generic 'Tide Station Hub'. This reuses the single existing STATION_LOCATION value rather than requiring a separate file, so there is only one place to configure a station's display name. If STATION_LOCATION is unset, or </w:t>
+      </w:r>
+      <w:proofErr w:type="spellStart"/>
+      <w:r>
+        <w:t>sitename.cgi</w:t>
+      </w:r>
+      <w:proofErr w:type="spellEnd"/>
+      <w:r>
+        <w:t xml:space="preserve"> is not installed in </w:t>
+      </w:r>
+      <w:proofErr w:type="spellStart"/>
+      <w:r>
+        <w:t>cgi</w:t>
+      </w:r>
+      <w:proofErr w:type="spellEnd"/>
+      <w:r>
+        <w:t>-bin, index.html falls back to the generic title with no error.</w:t>
       </w:r>
     </w:p>
     <w:p>
@@ -8675,7 +9070,7 @@
         </w:pBdr>
         <w:spacing w:before="480" w:after="160"/>
       </w:pPr>
-      <w:bookmarkStart w:id="40" w:name="_Toc234847851"/>
+      <w:bookmarkStart w:id="44" w:name="_Toc235270970"/>
       <w:r>
         <w:rPr>
           <w:rFonts w:ascii="Arial" w:eastAsia="Arial" w:hAnsi="Arial" w:cs="Arial"/>
@@ -8688,14 +9083,14 @@
         <w:lastRenderedPageBreak/>
         <w:t>9. Alert System</w:t>
       </w:r>
-      <w:bookmarkEnd w:id="40"/>
+      <w:bookmarkEnd w:id="44"/>
     </w:p>
     <w:p>
       <w:pPr>
         <w:pStyle w:val="Heading2"/>
         <w:spacing w:before="280" w:after="100"/>
       </w:pPr>
-      <w:bookmarkStart w:id="41" w:name="_Toc234847852"/>
+      <w:bookmarkStart w:id="45" w:name="_Toc235270971"/>
       <w:r>
         <w:rPr>
           <w:rFonts w:ascii="Arial" w:eastAsia="Arial" w:hAnsi="Arial" w:cs="Arial"/>
@@ -8707,7 +9102,7 @@
         </w:rPr>
         <w:t>9.1 Email Delivery</w:t>
       </w:r>
-      <w:bookmarkEnd w:id="41"/>
+      <w:bookmarkEnd w:id="45"/>
     </w:p>
     <w:p>
       <w:pPr>
@@ -8763,7 +9158,7 @@
         <w:pStyle w:val="Heading2"/>
         <w:spacing w:before="280" w:after="100"/>
       </w:pPr>
-      <w:bookmarkStart w:id="42" w:name="_Toc234847853"/>
+      <w:bookmarkStart w:id="46" w:name="_Toc235270972"/>
       <w:r>
         <w:rPr>
           <w:rFonts w:ascii="Arial" w:eastAsia="Arial" w:hAnsi="Arial" w:cs="Arial"/>
@@ -8775,7 +9170,7 @@
         </w:rPr>
         <w:t>9.2 SMS Delivery</w:t>
       </w:r>
-      <w:bookmarkEnd w:id="42"/>
+      <w:bookmarkEnd w:id="46"/>
     </w:p>
     <w:p>
       <w:pPr>
@@ -8799,7 +9194,7 @@
         <w:pStyle w:val="Heading2"/>
         <w:spacing w:before="280" w:after="100"/>
       </w:pPr>
-      <w:bookmarkStart w:id="43" w:name="_Toc234847854"/>
+      <w:bookmarkStart w:id="47" w:name="_Toc235270973"/>
       <w:r>
         <w:rPr>
           <w:rFonts w:ascii="Arial" w:eastAsia="Arial" w:hAnsi="Arial" w:cs="Arial"/>
@@ -8811,7 +9206,7 @@
         </w:rPr>
         <w:t>9.3 Alert Evaluation</w:t>
       </w:r>
-      <w:bookmarkEnd w:id="43"/>
+      <w:bookmarkEnd w:id="47"/>
     </w:p>
     <w:p>
       <w:pPr>
@@ -8861,7 +9256,7 @@
         </w:pBdr>
         <w:spacing w:before="480" w:after="160"/>
       </w:pPr>
-      <w:bookmarkStart w:id="44" w:name="_Toc234847855"/>
+      <w:bookmarkStart w:id="48" w:name="_Toc235270974"/>
       <w:r>
         <w:rPr>
           <w:rFonts w:ascii="Arial" w:eastAsia="Arial" w:hAnsi="Arial" w:cs="Arial"/>
@@ -8874,7 +9269,7 @@
         <w:lastRenderedPageBreak/>
         <w:t>10. External Service and Account Dependencies</w:t>
       </w:r>
-      <w:bookmarkEnd w:id="44"/>
+      <w:bookmarkEnd w:id="48"/>
     </w:p>
     <w:p>
       <w:pPr>
@@ -9283,7 +9678,11 @@
           </w:tcPr>
           <w:p>
             <w:r>
-              <w:t>Provides internet access to station’s website pages.</w:t>
+              <w:rPr>
+                <w:sz w:val="20"/>
+                <w:szCs w:val="20"/>
+              </w:rPr>
+              <w:t>[Ken: confirm exact configuration/role]</w:t>
             </w:r>
           </w:p>
         </w:tc>
@@ -9376,7 +9775,7 @@
         </w:pBdr>
         <w:spacing w:before="480" w:after="160"/>
       </w:pPr>
-      <w:bookmarkStart w:id="45" w:name="_Toc234847856"/>
+      <w:bookmarkStart w:id="49" w:name="_Toc235270975"/>
       <w:r>
         <w:rPr>
           <w:rFonts w:ascii="Arial" w:eastAsia="Arial" w:hAnsi="Arial" w:cs="Arial"/>
@@ -9389,14 +9788,14 @@
         <w:lastRenderedPageBreak/>
         <w:t>11. Deployment and Installation</w:t>
       </w:r>
-      <w:bookmarkEnd w:id="45"/>
+      <w:bookmarkEnd w:id="49"/>
     </w:p>
     <w:p>
       <w:pPr>
         <w:pStyle w:val="Heading2"/>
         <w:spacing w:before="280" w:after="100"/>
       </w:pPr>
-      <w:bookmarkStart w:id="46" w:name="_Toc234847857"/>
+      <w:bookmarkStart w:id="50" w:name="_Toc235270976"/>
       <w:r>
         <w:rPr>
           <w:rFonts w:ascii="Arial" w:eastAsia="Arial" w:hAnsi="Arial" w:cs="Arial"/>
@@ -9408,7 +9807,7 @@
         </w:rPr>
         <w:t>11.1 install.sh</w:t>
       </w:r>
-      <w:bookmarkEnd w:id="46"/>
+      <w:bookmarkEnd w:id="50"/>
     </w:p>
     <w:p>
       <w:pPr>
@@ -9444,7 +9843,7 @@
         <w:pStyle w:val="Heading2"/>
         <w:spacing w:before="280" w:after="100"/>
       </w:pPr>
-      <w:bookmarkStart w:id="47" w:name="_Toc234847858"/>
+      <w:bookmarkStart w:id="51" w:name="_Toc235270977"/>
       <w:r>
         <w:rPr>
           <w:rFonts w:ascii="Arial" w:eastAsia="Arial" w:hAnsi="Arial" w:cs="Arial"/>
@@ -9456,7 +9855,7 @@
         </w:rPr>
         <w:t>11.2 Python Package Requirements</w:t>
       </w:r>
-      <w:bookmarkEnd w:id="47"/>
+      <w:bookmarkEnd w:id="51"/>
     </w:p>
     <w:p>
       <w:pPr>
@@ -9544,7 +9943,7 @@
         <w:pStyle w:val="Heading2"/>
         <w:spacing w:before="280" w:after="100"/>
       </w:pPr>
-      <w:bookmarkStart w:id="48" w:name="_Toc234847859"/>
+      <w:bookmarkStart w:id="52" w:name="_Toc235270978"/>
       <w:r>
         <w:rPr>
           <w:rFonts w:ascii="Arial" w:eastAsia="Arial" w:hAnsi="Arial" w:cs="Arial"/>
@@ -9556,7 +9955,7 @@
         </w:rPr>
         <w:t>11.3 Remote Desktop</w:t>
       </w:r>
-      <w:bookmarkEnd w:id="48"/>
+      <w:bookmarkEnd w:id="52"/>
     </w:p>
     <w:p>
       <w:pPr>
@@ -9609,7 +10008,7 @@
         </w:pBdr>
         <w:spacing w:before="480" w:after="160"/>
       </w:pPr>
-      <w:bookmarkStart w:id="49" w:name="_Toc234847860"/>
+      <w:bookmarkStart w:id="53" w:name="_Toc235270979"/>
       <w:r>
         <w:rPr>
           <w:rFonts w:ascii="Arial" w:eastAsia="Arial" w:hAnsi="Arial" w:cs="Arial"/>
@@ -9622,7 +10021,7 @@
         <w:lastRenderedPageBreak/>
         <w:t>12. Known Technical Debt</w:t>
       </w:r>
-      <w:bookmarkEnd w:id="49"/>
+      <w:bookmarkEnd w:id="53"/>
     </w:p>
     <w:p>
       <w:pPr>
@@ -9638,7 +10037,7 @@
         <w:pStyle w:val="Heading3"/>
         <w:spacing w:before="200" w:after="80"/>
       </w:pPr>
-      <w:bookmarkStart w:id="50" w:name="_Toc234847861"/>
+      <w:bookmarkStart w:id="54" w:name="_Toc235270980"/>
       <w:proofErr w:type="spellStart"/>
       <w:proofErr w:type="gramStart"/>
       <w:r>
@@ -9665,7 +10064,7 @@
         </w:rPr>
         <w:t>() and the Python 3.13 removal</w:t>
       </w:r>
-      <w:bookmarkEnd w:id="50"/>
+      <w:bookmarkEnd w:id="54"/>
     </w:p>
     <w:p>
       <w:pPr>
@@ -9746,7 +10145,7 @@
         <w:pStyle w:val="Heading3"/>
         <w:spacing w:before="200" w:after="80"/>
       </w:pPr>
-      <w:bookmarkStart w:id="51" w:name="_Toc234847862"/>
+      <w:bookmarkStart w:id="55" w:name="_Toc235270981"/>
       <w:r>
         <w:rPr>
           <w:rFonts w:ascii="Arial" w:eastAsia="Arial" w:hAnsi="Arial" w:cs="Arial"/>
@@ -9758,7 +10157,7 @@
         </w:rPr>
         <w:t>Duplicate sun-calculation packages</w:t>
       </w:r>
-      <w:bookmarkEnd w:id="51"/>
+      <w:bookmarkEnd w:id="55"/>
     </w:p>
     <w:p>
       <w:pPr>
@@ -9798,7 +10197,7 @@
         <w:pStyle w:val="Heading3"/>
         <w:spacing w:before="200" w:after="80"/>
       </w:pPr>
-      <w:bookmarkStart w:id="52" w:name="_Toc234847863"/>
+      <w:bookmarkStart w:id="56" w:name="_Toc235270982"/>
       <w:r>
         <w:rPr>
           <w:rFonts w:ascii="Arial" w:eastAsia="Arial" w:hAnsi="Arial" w:cs="Arial"/>
@@ -9810,7 +10209,7 @@
         </w:rPr>
         <w:t>install.sh incompleteness</w:t>
       </w:r>
-      <w:bookmarkEnd w:id="52"/>
+      <w:bookmarkEnd w:id="56"/>
     </w:p>
     <w:p>
       <w:pPr>
@@ -9826,7 +10225,7 @@
         <w:pStyle w:val="Heading3"/>
         <w:spacing w:before="200" w:after="80"/>
       </w:pPr>
-      <w:bookmarkStart w:id="53" w:name="_Toc234847864"/>
+      <w:bookmarkStart w:id="57" w:name="_Toc235270983"/>
       <w:r>
         <w:rPr>
           <w:rFonts w:ascii="Arial" w:eastAsia="Arial" w:hAnsi="Arial" w:cs="Arial"/>
@@ -9838,7 +10237,7 @@
         </w:rPr>
         <w:t>Undocumented database schema</w:t>
       </w:r>
-      <w:bookmarkEnd w:id="53"/>
+      <w:bookmarkEnd w:id="57"/>
     </w:p>
     <w:p>
       <w:pPr>
@@ -9870,7 +10269,7 @@
         </w:pBdr>
         <w:spacing w:before="480" w:after="160"/>
       </w:pPr>
-      <w:bookmarkStart w:id="54" w:name="_Toc234847865"/>
+      <w:bookmarkStart w:id="58" w:name="_Toc235270984"/>
       <w:r>
         <w:rPr>
           <w:rFonts w:ascii="Arial" w:eastAsia="Arial" w:hAnsi="Arial" w:cs="Arial"/>
@@ -9883,14 +10282,14 @@
         <w:lastRenderedPageBreak/>
         <w:t>13. Appendices</w:t>
       </w:r>
-      <w:bookmarkEnd w:id="54"/>
+      <w:bookmarkEnd w:id="58"/>
     </w:p>
     <w:p>
       <w:pPr>
         <w:pStyle w:val="Heading2"/>
         <w:spacing w:before="280" w:after="100"/>
       </w:pPr>
-      <w:bookmarkStart w:id="55" w:name="_Toc234847866"/>
+      <w:bookmarkStart w:id="59" w:name="_Toc235270985"/>
       <w:r>
         <w:rPr>
           <w:rFonts w:ascii="Arial" w:eastAsia="Arial" w:hAnsi="Arial" w:cs="Arial"/>
@@ -9926,7 +10325,7 @@
         </w:rPr>
         <w:t xml:space="preserve"> Reference</w:t>
       </w:r>
-      <w:bookmarkEnd w:id="55"/>
+      <w:bookmarkEnd w:id="59"/>
     </w:p>
     <w:tbl>
       <w:tblPr>
@@ -10742,7 +11141,7 @@
         <w:pStyle w:val="Heading2"/>
         <w:spacing w:before="280" w:after="100"/>
       </w:pPr>
-      <w:bookmarkStart w:id="56" w:name="_Toc234847867"/>
+      <w:bookmarkStart w:id="60" w:name="_Toc235270986"/>
       <w:r>
         <w:rPr>
           <w:rFonts w:ascii="Arial" w:eastAsia="Arial" w:hAnsi="Arial" w:cs="Arial"/>
@@ -10778,7 +11177,7 @@
         </w:rPr>
         <w:t xml:space="preserve"> Services</w:t>
       </w:r>
-      <w:bookmarkEnd w:id="56"/>
+      <w:bookmarkEnd w:id="60"/>
     </w:p>
     <w:tbl>
       <w:tblPr>
@@ -11047,7 +11446,7 @@
         <w:pStyle w:val="Heading2"/>
         <w:spacing w:before="280" w:after="100"/>
       </w:pPr>
-      <w:bookmarkStart w:id="57" w:name="_Toc234847868"/>
+      <w:bookmarkStart w:id="61" w:name="_Toc235270987"/>
       <w:r>
         <w:rPr>
           <w:rFonts w:ascii="Arial" w:eastAsia="Arial" w:hAnsi="Arial" w:cs="Arial"/>
@@ -11059,7 +11458,7 @@
         </w:rPr>
         <w:t>Appendix C -- Source Repository</w:t>
       </w:r>
-      <w:bookmarkEnd w:id="57"/>
+      <w:bookmarkEnd w:id="61"/>
     </w:p>
     <w:p>
       <w:pPr>
@@ -11071,8 +11470,8 @@
       </w:r>
     </w:p>
     <w:sectPr>
-      <w:headerReference w:type="default" r:id="rId9"/>
-      <w:footerReference w:type="default" r:id="rId10"/>
+      <w:headerReference w:type="default" r:id="rId7"/>
+      <w:footerReference w:type="default" r:id="rId8"/>
       <w:pgSz w:w="12240" w:h="15840"/>
       <w:pgMar w:top="1080" w:right="1080" w:bottom="1080" w:left="1080" w:header="708" w:footer="708" w:gutter="0"/>
       <w:cols w:space="720"/>
@@ -11201,10 +11600,10 @@
 <file path=word/numbering.xml><?xml version="1.0" encoding="utf-8"?>
 <w:numbering xmlns:wpc="http://schemas.microsoft.com/office/word/2010/wordprocessingCanvas" xmlns:cx="http://schemas.microsoft.com/office/drawing/2014/chartex" xmlns:cx1="http://schemas.microsoft.com/office/drawing/2015/9/8/chartex" xmlns:cx2="http://schemas.microsoft.com/office/drawing/2015/10/21/chartex" xmlns:cx3="http://schemas.microsoft.com/office/drawing/2016/5/9/chartex" xmlns:cx4="http://schemas.microsoft.com/office/drawing/2016/5/10/chartex" xmlns:cx5="http://schemas.microsoft.com/office/drawing/2016/5/11/chartex" xmlns:cx6="http://schemas.microsoft.com/office/drawing/2016/5/12/chartex" xmlns:cx7="http://schemas.microsoft.com/office/drawing/2016/5/13/chartex" xmlns:cx8="http://schemas.microsoft.com/office/drawing/2016/5/14/chartex" xmlns:mc="http://schemas.openxmlformats.org/markup-compatibility/2006" xmlns:aink="http://schemas.microsoft.com/office/drawing/2016/ink" xmlns:am3d="http://schemas.microsoft.com/office/drawing/2017/model3d" xmlns:o="urn:schemas-microsoft-com:office:office" xmlns:oel="http://schemas.microsoft.com/office/2019/extlst" xmlns:r="http://schemas.openxmlformats.org/officeDocument/2006/relationships" xmlns:m="http://schemas.openxmlformats.org/officeDocument/2006/math" xmlns:v="urn:schemas-microsoft-com:vml" xmlns:wp14="http://schemas.microsoft.com/office/word/2010/wordprocessingDrawing" xmlns:wp="http://schemas.openxmlformats.org/drawingml/2006/wordprocessingDrawing" xmlns:w10="urn:schemas-microsoft-com:office:word" xmlns:w="http://schemas.openxmlformats.org/wordprocessingml/2006/main" xmlns:w14="http://schemas.microsoft.com/office/word/2010/wordml" xmlns:w15="http://schemas.microsoft.com/office/word/2012/wordml" xmlns:w16cex="http://schemas.microsoft.com/office/word/2018/wordml/cex" xmlns:w16cid="http://schemas.microsoft.com/office/word/2016/wordml/cid" xmlns:w16="http://schemas.microsoft.com/office/word/2018/wordml" xmlns:w16du="http://schemas.microsoft.com/office/word/2023/wordml/word16du" xmlns:w16sdtdh="http://schemas.microsoft.com/office/word/2020/wordml/sdtdatahash" xmlns:w16sdtfl="http://schemas.microsoft.com/office/word/2024/wordml/sdtformatlock" xmlns:w16se="http://schemas.microsoft.com/office/word/2015/wordml/symex" xmlns:wpg="http://schemas.microsoft.com/office/word/2010/wordprocessingGroup" xmlns:wpi="http://schemas.microsoft.com/office/word/2010/wordprocessingInk" xmlns:wne="http://schemas.microsoft.com/office/word/2006/wordml" xmlns:wps="http://schemas.microsoft.com/office/word/2010/wordprocessingShape" mc:Ignorable="w14 w15 w16se w16cid w16 w16cex w16sdtdh w16sdtfl w16du wp14">
   <w:abstractNum w:abstractNumId="0" w15:restartNumberingAfterBreak="0">
-    <w:nsid w:val="0D134A69"/>
+    <w:nsid w:val="57FF0D8F"/>
     <w:multiLevelType w:val="hybridMultilevel"/>
-    <w:tmpl w:val="40EE6EBC"/>
-    <w:lvl w:ilvl="0" w:tplc="B64046D4">
+    <w:tmpl w:val="72B4F632"/>
+    <w:lvl w:ilvl="0" w:tplc="771044FE">
       <w:start w:val="1"/>
       <w:numFmt w:val="bullet"/>
       <w:lvlText w:val="●"/>
@@ -11213,7 +11612,7 @@
         <w:ind w:left="720" w:hanging="360"/>
       </w:pPr>
     </w:lvl>
-    <w:lvl w:ilvl="1" w:tplc="A65A64FE">
+    <w:lvl w:ilvl="1" w:tplc="319C9184">
       <w:start w:val="1"/>
       <w:numFmt w:val="bullet"/>
       <w:lvlText w:val="○"/>
@@ -11222,7 +11621,7 @@
         <w:ind w:left="1440" w:hanging="360"/>
       </w:pPr>
     </w:lvl>
-    <w:lvl w:ilvl="2" w:tplc="0470B2FE">
+    <w:lvl w:ilvl="2" w:tplc="F1C6E76C">
       <w:start w:val="1"/>
       <w:numFmt w:val="bullet"/>
       <w:lvlText w:val="■"/>
@@ -11231,7 +11630,7 @@
         <w:ind w:left="2160" w:hanging="360"/>
       </w:pPr>
     </w:lvl>
-    <w:lvl w:ilvl="3" w:tplc="4AFC094C">
+    <w:lvl w:ilvl="3" w:tplc="A26A4D0C">
       <w:start w:val="1"/>
       <w:numFmt w:val="bullet"/>
       <w:lvlText w:val="●"/>
@@ -11240,7 +11639,7 @@
         <w:ind w:left="2880" w:hanging="360"/>
       </w:pPr>
     </w:lvl>
-    <w:lvl w:ilvl="4" w:tplc="01C8AEE8">
+    <w:lvl w:ilvl="4" w:tplc="36ACF37E">
       <w:start w:val="1"/>
       <w:numFmt w:val="bullet"/>
       <w:lvlText w:val="○"/>
@@ -11249,7 +11648,7 @@
         <w:ind w:left="3600" w:hanging="360"/>
       </w:pPr>
     </w:lvl>
-    <w:lvl w:ilvl="5" w:tplc="A986FD3E">
+    <w:lvl w:ilvl="5" w:tplc="F21CB02C">
       <w:start w:val="1"/>
       <w:numFmt w:val="bullet"/>
       <w:lvlText w:val="■"/>
@@ -11258,7 +11657,7 @@
         <w:ind w:left="4320" w:hanging="360"/>
       </w:pPr>
     </w:lvl>
-    <w:lvl w:ilvl="6" w:tplc="C0702B72">
+    <w:lvl w:ilvl="6" w:tplc="F8FC623C">
       <w:start w:val="1"/>
       <w:numFmt w:val="bullet"/>
       <w:lvlText w:val="●"/>
@@ -11267,7 +11666,7 @@
         <w:ind w:left="5040" w:hanging="360"/>
       </w:pPr>
     </w:lvl>
-    <w:lvl w:ilvl="7" w:tplc="137E4F48">
+    <w:lvl w:ilvl="7" w:tplc="F5E29766">
       <w:start w:val="1"/>
       <w:numFmt w:val="bullet"/>
       <w:lvlText w:val="●"/>
@@ -11276,7 +11675,7 @@
         <w:ind w:left="5760" w:hanging="360"/>
       </w:pPr>
     </w:lvl>
-    <w:lvl w:ilvl="8" w:tplc="0664642E">
+    <w:lvl w:ilvl="8" w:tplc="D04A4602">
       <w:start w:val="1"/>
       <w:numFmt w:val="bullet"/>
       <w:lvlText w:val="●"/>
@@ -11287,10 +11686,10 @@
     </w:lvl>
   </w:abstractNum>
   <w:abstractNum w:abstractNumId="1" w15:restartNumberingAfterBreak="0">
-    <w:nsid w:val="38BE1AD4"/>
+    <w:nsid w:val="743D2541"/>
     <w:multiLevelType w:val="hybridMultilevel"/>
-    <w:tmpl w:val="EC2ABE32"/>
-    <w:lvl w:ilvl="0" w:tplc="1D0E1B72">
+    <w:tmpl w:val="B6CA0F76"/>
+    <w:lvl w:ilvl="0" w:tplc="8B12A78A">
       <w:start w:val="1"/>
       <w:numFmt w:val="bullet"/>
       <w:lvlText w:val="•"/>
@@ -11299,7 +11698,7 @@
         <w:ind w:left="420" w:hanging="260"/>
       </w:pPr>
     </w:lvl>
-    <w:lvl w:ilvl="1" w:tplc="5EB81DBC">
+    <w:lvl w:ilvl="1" w:tplc="EA869AEA">
       <w:start w:val="1"/>
       <w:numFmt w:val="bullet"/>
       <w:lvlText w:val="◦"/>
@@ -11308,49 +11707,49 @@
         <w:ind w:left="840" w:hanging="260"/>
       </w:pPr>
     </w:lvl>
-    <w:lvl w:ilvl="2" w:tplc="07E06E30">
+    <w:lvl w:ilvl="2" w:tplc="8D7C5D3A">
       <w:numFmt w:val="decimal"/>
       <w:lvlText w:val=""/>
       <w:lvlJc w:val="left"/>
     </w:lvl>
-    <w:lvl w:ilvl="3" w:tplc="BC64F166">
+    <w:lvl w:ilvl="3" w:tplc="F21C9B9A">
       <w:numFmt w:val="decimal"/>
       <w:lvlText w:val=""/>
       <w:lvlJc w:val="left"/>
     </w:lvl>
-    <w:lvl w:ilvl="4" w:tplc="565EDC6E">
+    <w:lvl w:ilvl="4" w:tplc="FDC05A42">
       <w:numFmt w:val="decimal"/>
       <w:lvlText w:val=""/>
       <w:lvlJc w:val="left"/>
     </w:lvl>
-    <w:lvl w:ilvl="5" w:tplc="13D07FD6">
+    <w:lvl w:ilvl="5" w:tplc="EA267452">
       <w:numFmt w:val="decimal"/>
       <w:lvlText w:val=""/>
       <w:lvlJc w:val="left"/>
     </w:lvl>
-    <w:lvl w:ilvl="6" w:tplc="CE400E94">
+    <w:lvl w:ilvl="6" w:tplc="FB941D7A">
       <w:numFmt w:val="decimal"/>
       <w:lvlText w:val=""/>
       <w:lvlJc w:val="left"/>
     </w:lvl>
-    <w:lvl w:ilvl="7" w:tplc="8DEAB024">
+    <w:lvl w:ilvl="7" w:tplc="27E6F740">
       <w:numFmt w:val="decimal"/>
       <w:lvlText w:val=""/>
       <w:lvlJc w:val="left"/>
     </w:lvl>
-    <w:lvl w:ilvl="8" w:tplc="D826A9B6">
+    <w:lvl w:ilvl="8" w:tplc="1EDEA248">
       <w:numFmt w:val="decimal"/>
       <w:lvlText w:val=""/>
       <w:lvlJc w:val="left"/>
     </w:lvl>
   </w:abstractNum>
-  <w:num w:numId="1" w16cid:durableId="933131647">
+  <w:num w:numId="1" w16cid:durableId="1123227930">
     <w:abstractNumId w:val="0"/>
     <w:lvlOverride w:ilvl="0">
       <w:startOverride w:val="1"/>
     </w:lvlOverride>
   </w:num>
-  <w:num w:numId="2" w16cid:durableId="2089618234">
+  <w:num w:numId="2" w16cid:durableId="2091271244">
     <w:abstractNumId w:val="1"/>
     <w:lvlOverride w:ilvl="0">
       <w:startOverride w:val="1"/>
@@ -11962,7 +12361,7 @@
     <w:autoRedefine/>
     <w:uiPriority w:val="39"/>
     <w:unhideWhenUsed/>
-    <w:rsid w:val="00D55E46"/>
+    <w:rsid w:val="00610757"/>
     <w:pPr>
       <w:spacing w:after="100"/>
     </w:pPr>
@@ -11974,7 +12373,7 @@
     <w:autoRedefine/>
     <w:uiPriority w:val="39"/>
     <w:unhideWhenUsed/>
-    <w:rsid w:val="00D55E46"/>
+    <w:rsid w:val="00610757"/>
     <w:pPr>
       <w:spacing w:after="100"/>
       <w:ind w:left="220"/>
@@ -11987,23 +12386,11 @@
     <w:autoRedefine/>
     <w:uiPriority w:val="39"/>
     <w:unhideWhenUsed/>
-    <w:rsid w:val="00D55E46"/>
+    <w:rsid w:val="00610757"/>
     <w:pPr>
       <w:spacing w:after="100"/>
       <w:ind w:left="440"/>
     </w:pPr>
-  </w:style>
-  <w:style w:type="character" w:styleId="UnresolvedMention">
-    <w:name w:val="Unresolved Mention"/>
-    <w:basedOn w:val="DefaultParagraphFont"/>
-    <w:uiPriority w:val="99"/>
-    <w:semiHidden/>
-    <w:unhideWhenUsed/>
-    <w:rsid w:val="00CA41B0"/>
-    <w:rPr>
-      <w:color w:val="605E5C"/>
-      <w:shd w:val="clear" w:color="auto" w:fill="E1DFDD"/>
-    </w:rPr>
   </w:style>
 </w:styles>
 </file>

</xml_diff>